<commit_message>
VII.H draft fully in English (docx/pdf regenerated + md notes translated)
Co-Authored-By: Claude Fable 5 <noreply@anthropic.com>
</commit_message>
<xml_diff>
--- a/docs/G1_Empirical_Validation_VIIH_draft.docx
+++ b/docs/G1_Empirical_Validation_VIIH_draft.docx
@@ -1016,7 +1016,7 @@
           <w:sz w:val="28"/>
           <w:szCs w:val="28"/>
         </w:rPr>
-        <w:t xml:space="preserve">Anexo — Notas internas (no van al paper)</w:t>
+        <w:t xml:space="preserve">Annex — Internal notes (not for the manuscript)</w:t>
       </w:r>
     </w:p>
     <w:p>
@@ -1024,7 +1024,7 @@
         <w:spacing w:after="120" w:line="276" w:lineRule="auto"/>
       </w:pPr>
       <w:r>
-        <w:t xml:space="preserve">Los brazos wrong/wrongdst/wrongdstsim con 0 derrames NO son fallo del experimento: son el hallazgo (5). Si Renxi quiere la curva de recuperación cross-run EN SIM, la forma fiel a la tesis (Cap. 5, 5.3.6.3) es forzar la analogía (lock) durante las primeras K runs — se puede añadir (G1_M2_LOCK), pero lo natural es capturarla en el robot real, donde el crucero certifica a Efficient de verdad.</w:t>
+        <w:t xml:space="preserve">The zero-spill outcome of the wrong/wrongdst/wrongdstsim arms is NOT an experimental failure: it is finding (5). If the cross-run recovery curve is wanted IN SIMULATION, the protocol faithful to the thesis (Ch. 5, 5.3.6.3) is to force the wrong analogy (lock) for the first K runs — implementable as G1_M2_LOCK — but the natural place to capture it is the physical robot, where open-floor cruising genuinely certifies the Efficient capability.</w:t>
       </w:r>
     </w:p>
     <w:p>
@@ -1032,7 +1032,7 @@
         <w:spacing w:after="120" w:line="276" w:lineRule="auto"/>
       </w:pPr>
       <w:r>
-        <w:t xml:space="preserve">La tabla omite brazos redundantes (wrongsim/wrongdst*); están en analyze_campaign.py y en runs_summary.csv (filtrar env=sim, sim_id lab_v1_payload_*).</w:t>
+        <w:t xml:space="preserve">The table omits the redundant arms (wrongsim / wrongdst / wrongdstsim); they are available via analyze_campaign.py and in runs_summary.csv (filter env=sim, sim_id lab_v1_payload_*).</w:t>
       </w:r>
     </w:p>
     <w:p>
@@ -1040,7 +1040,7 @@
         <w:spacing w:after="120" w:line="276" w:lineRule="auto"/>
       </w:pPr>
       <w:r>
-        <w:t xml:space="preserve">Contraste con la sim 2-D de la tesis (warehouse-cluttered): M0 SE=13.0 / 2.12 spills·run; M2 SE=37.6 / 0.28. El gemelo 3-D reproduce el mismo orden M0 &lt; M1 ≈ M2 en seguridad con la física de sloshing real.</w:t>
+        <w:t xml:space="preserve">Contrast with the thesis 2-D simulation (warehouse-cluttered): M0 SE=13.0 / 2.12 spills·run; M2 SE=37.6 / 0.28. The 3-D twin reproduces the same safety ordering M0 &lt; M1 ≈ M2 with physically grounded sloshing.</w:t>
       </w:r>
     </w:p>
     <w:p>
@@ -1048,7 +1048,7 @@
         <w:spacing w:after="120" w:line="276" w:lineRule="auto"/>
       </w:pPr>
       <w:r>
-        <w:t xml:space="preserve">Reproducción: python3 sim_campaign.py (brazos por CAMPAIGN_ARMS) · python3 analyze_campaign.py · commits hasta 0b6ea24 en main.</w:t>
+        <w:t xml:space="preserve">Reproduction: python3 sim_campaign.py (arms via CAMPAIGN_ARMS) · python3 analyze_campaign.py · commits up to 0b6ea24 on main.</w:t>
       </w:r>
     </w:p>
     <w:sectPr>

</xml_diff>

<commit_message>
draft VII.H completo: tabla de los 11 brazos + 5 figuras generadas de los datos de campana
Figuras (matplotlib sobre campaign_results.json): F1 trade-off tiempo/derrames,
F2 exposicion al riesgo por brazo, F3 regimen calibration-limited (distribuciones
de clearance vs fronteras QoE lab/gemelo), F4 delta de tapa M0-pasivo vs
M2-explotado, F5 traza de erosion de confianza Layer-2 con arranque corregido.
Todo en ingles. PDF exportado con Word y verificado visualmente (7 paginas).

Co-Authored-By: Claude Fable 5 <noreply@anthropic.com>
</commit_message>
<xml_diff>
--- a/docs/G1_Empirical_Validation_VIIH_draft.docx
+++ b/docs/G1_Empirical_Validation_VIIH_draft.docx
@@ -1,6 +1,6 @@
 
 <file path=word/document.xml><?xml version="1.0" encoding="utf-8"?>
-<w:document xmlns:w="http://schemas.openxmlformats.org/wordprocessingml/2006/main">
+<w:document xmlns:w="http://schemas.openxmlformats.org/wordprocessingml/2006/main" xmlns:r="http://schemas.openxmlformats.org/officeDocument/2006/relationships">
   <w:body>
     <w:p>
       <w:pPr>
@@ -27,7 +27,7 @@
           <w:sz w:val="22"/>
           <w:szCs w:val="22"/>
         </w:rPr>
-        <w:t xml:space="preserve">Methods, spill model, and governance algorithm — supporting material for Section VII.H</w:t>
+        <w:t xml:space="preserve">Methods, spill model, governance algorithm and full campaign results — supporting material for Section VII.H</w:t>
       </w:r>
     </w:p>
     <w:p>
@@ -41,7 +41,7 @@
           <w:sz w:val="20"/>
           <w:szCs w:val="20"/>
         </w:rPr>
-        <w:t xml:space="preserve">Simulation campaign 2026-07-04 · Unitree G1 · Gazebo (ROS 2 Humble) · 83 runs, 11 arms</w:t>
+        <w:t xml:space="preserve">Simulation campaign 2026-07-04 · Unitree G1 · Gazebo (ROS 2 Humble) · 99 simulation runs, 82 valid formal-campaign runs across 11 arms</w:t>
       </w:r>
     </w:p>
     <w:p>
@@ -63,7 +63,7 @@
         <w:spacing w:after="160" w:line="276" w:lineRule="auto"/>
       </w:pPr>
       <w:r>
-        <w:t xml:space="preserve">The physical robot is a Unitree G1 “Air” humanoid, a consumer unit whose only external interface is a single WebRTC session through the vendor app. The production navigation stack drives it by tapping that session over USB. For the twin we reuse </w:t>
+        <w:t xml:space="preserve">The physical robot is a Unitree G1 “Air” humanoid, a consumer unit whose only external interface is a single WebRTC session through the vendor app; the production navigation stack drives it by tapping that session over USB. For the twin we reuse </w:t>
       </w:r>
       <w:r>
         <w:rPr>
@@ -80,7 +80,7 @@
         <w:spacing w:after="160" w:line="276" w:lineRule="auto"/>
       </w:pPr>
       <w:r>
-        <w:t xml:space="preserve">The simulator runs inside a Docker container (ROS 2 Humble Desktop with Gazebo Classic, accessible over noVNC). The world, </w:t>
+        <w:t xml:space="preserve">The simulator runs in a Docker container (ROS 2 Humble Desktop, Gazebo Classic, noVNC). The world, </w:t>
       </w:r>
       <w:r>
         <w:rPr>
@@ -89,7 +89,7 @@
         <w:t xml:space="preserve">lab.world</w:t>
       </w:r>
       <w:r>
-        <w:t xml:space="preserve">, is generated programmatically from the robot's own SLAM maps of the real laboratory: wall occupancy cells become 2.2 m box obstacles in the robot's coordinate frame, so the twin's geometry, waypoints (A, B, C), and the 0.8 m doorway coincide with the real deployment. The doorway was re-carved to match the measured physical opening after the collision model was corrected (see §2).</w:t>
+        <w:t xml:space="preserve">, is generated programmatically from the robot's own SLAM maps of the real laboratory: wall occupancy cells become 2.2 m box obstacles in the robot's coordinate frame, so the twin's geometry, waypoints (A, B, C) and the 0.8 m doorway coincide with the real deployment.</w:t>
       </w:r>
     </w:p>
     <w:p>
@@ -111,16 +111,7 @@
         <w:spacing w:after="160" w:line="276" w:lineRule="auto"/>
       </w:pPr>
       <w:r>
-        <w:t xml:space="preserve">The robot is spawned from a URDF whose collision geometry is a single box matching the G1's real envelope (0.44 m shoulder width × 1.10 m tall, capped below the simulated LiDAR at z ≈ 1.20 m so the sensor does not see itself). A high mass (60 kg) and large diagonal inertia keep the base from tipping under the velocity-controlled gait; ground friction is set to zero so the planar-move plugin drives it as a velocity-controlled puck while wall contacts remain solid. Locomotion is commanded as gait velocity through </w:t>
-      </w:r>
-      <w:r>
-        <w:rPr>
-          <w:b/>
-        </w:rPr>
-        <w:t xml:space="preserve">gazebo_ros_planar_move</w:t>
-      </w:r>
-      <w:r>
-        <w:t xml:space="preserve"> (`/cmd_vel` → base motion, `/odom` published back); a 360-ray LiDAR at 10 Hz publishes `/scan`.</w:t>
+        <w:t xml:space="preserve">The robot is spawned from a URDF whose collision geometry is a single box matching the G1's real envelope (0.44 m shoulder width × 1.10 m tall, capped below the simulated LiDAR at z ≈ 1.20 m so the sensor does not see itself). High mass (60 kg) and large diagonal inertia keep the base upright under the velocity-controlled gait; ground friction is zero so the planar-move plugin drives it as a velocity-controlled puck while wall contacts remain solid. Locomotion is commanded as gait velocity through gazebo_ros_planar_move (/cmd_vel, /odom back); a 360-ray LiDAR at 10 Hz publishes /scan. The doorway was re-carved to the measured physical opening after the collision model was corrected: with the original carve the clear gap was 0.42 m and the realistic body physically could not pass — an artefact caught by consistency checking before any campaign data was taken.</w:t>
       </w:r>
     </w:p>
     <w:p>
@@ -135,23 +126,6 @@
           <w:szCs w:val="26"/>
         </w:rPr>
         <w:t xml:space="preserve">1.2  The adapter: same stack, simulated interface</w:t>
-      </w:r>
-    </w:p>
-    <w:p>
-      <w:pPr>
-        <w:spacing w:after="160" w:line="276" w:lineRule="auto"/>
-      </w:pPr>
-      <w:r>
-        <w:t xml:space="preserve">A thin adapter (</w:t>
-      </w:r>
-      <w:r>
-        <w:rPr>
-          <w:b/>
-        </w:rPr>
-        <w:t xml:space="preserve">SimCDP</w:t>
-      </w:r>
-      <w:r>
-        <w:t xml:space="preserve">) replaces the WebRTC/WebView interface object with one that resolves the stack's own calls against ROS 2 over rosbridge (WebSocket, port 8765):</w:t>
       </w:r>
     </w:p>
     <w:p>
@@ -169,7 +143,7 @@
         <w:t xml:space="preserve">Velocity commands</w:t>
       </w:r>
       <w:r>
-        <w:t xml:space="preserve"> `{lx, ly, rx, ry}` → `/cmd_vel`, using the physical robot's measured stick-to-velocity mapping (deadzone subtracted, not clipped; lx&gt;0 = right; ly = 0.40 → 0.30 m/s), so simulated and real dynamics coincide.</w:t>
+        <w:t xml:space="preserve"> {lx, ly, rx, ry} → /cmd_vel, using the physical robot's measured stick-to-velocity mapping (deadzone subtracted, not clipped; ly = 0.40 → 0.30 m/s), so simulated and real dynamics coincide.</w:t>
       </w:r>
     </w:p>
     <w:p>
@@ -187,7 +161,7 @@
         <w:t xml:space="preserve">Pose</w:t>
       </w:r>
       <w:r>
-        <w:t xml:space="preserve"> ← `/odom` (in simulation the map and odometry frames coincide, so no relocalisation jitter).</w:t>
+        <w:t xml:space="preserve"> ← /odom (map and odometry frames coincide in simulation: no relocalisation jitter).</w:t>
       </w:r>
     </w:p>
     <w:p>
@@ -205,7 +179,7 @@
         <w:t xml:space="preserve">LiDAR</w:t>
       </w:r>
       <w:r>
-        <w:t xml:space="preserve"> ← `/scan`, the 360-ray sweep projected into a flat world-frame point cloud identical in shape to what the real WebView decoder produces.</w:t>
+        <w:t xml:space="preserve"> ← /scan, projected into a flat world-frame point cloud identical in shape to the real WebView decoder output.</w:t>
       </w:r>
     </w:p>
     <w:p>
@@ -213,7 +187,7 @@
         <w:spacing w:after="160" w:line="276" w:lineRule="auto"/>
       </w:pPr>
       <w:r>
-        <w:t xml:space="preserve">Camera perception is disabled in the twin (no visual channel); the LiDAR-driven planner and the governance layer are exercised in full. Data runs are always headless; the CPU renderer would otherwise steal cycles from physics.</w:t>
+        <w:t xml:space="preserve">Camera perception is disabled in the twin; the LiDAR-driven planner and the governance layer are exercised in full. Data runs are always headless.</w:t>
       </w:r>
     </w:p>
     <w:p>
@@ -266,7 +240,7 @@
           <w:sz w:val="18"/>
           <w:szCs w:val="18"/>
         </w:rPr>
-        <w:t xml:space="preserve">ω₀ = sqrt( g · k₁ · tanh(k₁·h) ),   k₁ = 1.841 / R     (≈ 21 rad/s for R = 4 cm, h = 8 cm)</w:t>
+        <w:t xml:space="preserve">ω₀ = sqrt( g · k₁ · tanh(k₁·h) ),  k₁ = 1.841 / R    (≈ 21 rad/s for R = 4 cm, h = 8 cm)</w:t>
       </w:r>
     </w:p>
     <w:p>
@@ -280,7 +254,41 @@
           <w:sz w:val="18"/>
           <w:szCs w:val="18"/>
         </w:rPr>
-        <w:t xml:space="preserve">η_target = −R · a_cup / g            (steady tilt of the surface)</w:t>
+        <w:t xml:space="preserve">η̈ = −2·ζ·ω₀·η̇ − ω₀² · (η + R·a_cup/g)    per body axis,  ζ = 0.06</w:t>
+      </w:r>
+    </w:p>
+    <w:p>
+      <w:pPr>
+        <w:spacing w:after="160" w:line="276" w:lineRule="auto"/>
+      </w:pPr>
+      <w:r>
+        <w:t xml:space="preserve">The cup is held ~0.25 m ahead of the base, so a_cup = a_base + α×r + ω×(ω×r): fast turning adds a lever term. Bipedal gait injects acceleration noise growing with speed (≈ v²; 1.4 Hz component plus broadband) — </w:t>
+      </w:r>
+      <w:r>
+        <w:rPr>
+          <w:b/>
+        </w:rPr>
+        <w:t xml:space="preserve">walking fast agitates the cup by itself</w:t>
+      </w:r>
+      <w:r>
+        <w:t xml:space="preserve">. A sharp deceleration while forward motion is still commanded (an external impact, not a commanded stop) adds a direct impulse. Commanded acceleration is low-pass filtered (τ = 0.25 s) because the real G1 ramps velocity smoothly whereas the planar-move plugin steps it instantaneously.</w:t>
+      </w:r>
+    </w:p>
+    <w:p>
+      <w:pPr>
+        <w:spacing w:after="160" w:line="276" w:lineRule="auto"/>
+      </w:pPr>
+      <w:r>
+        <w:t xml:space="preserve">Spills are drawn from a </w:t>
+      </w:r>
+      <w:r>
+        <w:rPr>
+          <w:b/>
+        </w:rPr>
+        <w:t xml:space="preserve">non-homogeneous Poisson process</w:t>
+      </w:r>
+      <w:r>
+        <w:t xml:space="preserve"> on how far the surface exceeds the freeboard (12 mm below the rim):</w:t>
       </w:r>
     </w:p>
     <w:p>
@@ -294,7 +302,7 @@
           <w:sz w:val="18"/>
           <w:szCs w:val="18"/>
         </w:rPr>
-        <w:t xml:space="preserve">η̈ = −2·ζ·ω₀·η̇ − ω₀² · (η − η_target)     per body axis,  ζ = 0.06</w:t>
+        <w:t xml:space="preserve">λ(t) = LID · λ₀ · max(0, |η|/freeboard − 1)² ,  λ₀ = 40 s⁻¹ ,  LID = 1.0 (open) / 0.25 (sealed)</w:t>
       </w:r>
     </w:p>
     <w:p>
@@ -302,81 +310,25 @@
         <w:spacing w:after="160" w:line="276" w:lineRule="auto"/>
       </w:pPr>
       <w:r>
-        <w:t xml:space="preserve">The cup is held in the hand ~0.25 m ahead of the base, so `a_cup = a_base + α×r + ω×(ω×r)`: turning fast adds a lever term. Bipedal gait injects an acceleration noise that grows with speed (≈ v², a 1.4 Hz component plus broadband) — </w:t>
+        <w:t xml:space="preserve">Each spill loses water (freeboard grows) and dissipates slosh energy. The model is </w:t>
       </w:r>
       <w:r>
         <w:rPr>
           <w:b/>
         </w:rPr>
-        <w:t xml:space="preserve">walking fast agitates the cup by itself</w:t>
-      </w:r>
-      <w:r>
-        <w:t xml:space="preserve">, independent of any single manoeuvre. A sharp deceleration while forward motion is still commanded (an external impact, not a commanded stop) adds a direct impulse. Commanded acceleration is low-pass filtered (τ = 0.25 s) because the real G1 ramps velocity smoothly whereas the planar-move plugin steps it instantaneously.</w:t>
-      </w:r>
-    </w:p>
-    <w:p>
-      <w:pPr>
-        <w:spacing w:after="160" w:line="276" w:lineRule="auto"/>
-      </w:pPr>
-      <w:r>
-        <w:t xml:space="preserve">A spill is drawn as a </w:t>
+        <w:t xml:space="preserve">observational only</w:t>
+      </w:r>
+      <w:r>
+        <w:t xml:space="preserve">: it never alters physics or control. Calibration against logged trajectories yields ≈ 2 spills per 80 s of sustained 0.30 m/s cruising and ≈ 0 at the governed 0.18 m/s ceiling, consistent with the jerk-dominated design of the 2-D thesis study. For the physical robot the same event channel accepts a </w:t>
       </w:r>
       <w:r>
         <w:rPr>
           <w:b/>
         </w:rPr>
-        <w:t xml:space="preserve">non-homogeneous Poisson process</w:t>
-      </w:r>
-      <w:r>
-        <w:t xml:space="preserve"> whose rate rises with how far the surface exceeds the freeboard (the 12 mm of clearance below the rim):</w:t>
-      </w:r>
-    </w:p>
-    <w:p>
-      <w:pPr>
-        <w:spacing w:after="120" w:line="276" w:lineRule="auto"/>
-      </w:pPr>
-      <w:r>
-        <w:rPr>
-          <w:rFonts w:ascii="Consolas" w:hAnsi="Consolas"/>
-          <w:color w:val="333333"/>
-          <w:sz w:val="18"/>
-          <w:szCs w:val="18"/>
-        </w:rPr>
-        <w:t xml:space="preserve">λ(t) = LID · λ₀ · max(0, |η|/freeboard − 1)² ,   λ₀ = 40 s⁻¹ ,   LID = 1.0 (open) / 0.25 (sealed)</w:t>
-      </w:r>
-    </w:p>
-    <w:p>
-      <w:pPr>
-        <w:spacing w:after="160" w:line="276" w:lineRule="auto"/>
-      </w:pPr>
-      <w:r>
-        <w:t xml:space="preserve">Each spill loses a little water (freeboard grows) and dissipates energy. The model is </w:t>
-      </w:r>
-      <w:r>
-        <w:rPr>
-          <w:b/>
-        </w:rPr>
-        <w:t xml:space="preserve">observational only</w:t>
-      </w:r>
-      <w:r>
-        <w:t xml:space="preserve"> — it never alters the physics or the control. It is fed the odometry stream at ~30 Hz and emits spill events with timestamps into the per-run dataset; continuous diagnostics (expected spill count = ∫λ dt, peak |η|/freeboard, fraction of time in the &gt;0.7 risk band) are recorded alongside. Calibration against logged trajectories gives ≈ 2 spills per 80 s of sustained 0.30 m/s cruising and ≈ 0 at the governed 0.18 m/s ceiling, consistent with the jerk-dominated design of the thesis 2-D study.</w:t>
-      </w:r>
-    </w:p>
-    <w:p>
-      <w:pPr>
-        <w:spacing w:after="160" w:line="276" w:lineRule="auto"/>
-      </w:pPr>
-      <w:r>
-        <w:t xml:space="preserve">For the physical robot the same event channel accepts a </w:t>
-      </w:r>
-      <w:r>
-        <w:rPr>
-          <w:b/>
-        </w:rPr>
         <w:t xml:space="preserve">manual ground-truth mark</w:t>
       </w:r>
       <w:r>
-        <w:t xml:space="preserve">: a human presses a key (or publishes an empty ROS message) each time water is seen to spill, and the event is timestamped into the identical dataset field, so simulated and real runs are scored the same way.</w:t>
+        <w:t xml:space="preserve"> (a keypress or an empty ROS message per observed spill), timestamped into the identical dataset field.</w:t>
       </w:r>
     </w:p>
     <w:p>
@@ -406,21 +358,7 @@
         <w:spacing w:after="160" w:line="276" w:lineRule="auto"/>
       </w:pPr>
       <w:r>
-        <w:t xml:space="preserve">The governance layer is the configuration-first meta-reasoner (Meta-Reasoner 2.0) driven through a bridge that packages the stack's per-tick telemetry as shared-experience readings at 2 Hz. Each tick the reasoner evaluates the candidate analogies (behaviour models, e.g. Efficient_Nav / Cautious_Nav) against their QoE boundaries and returns one of KEEP / SWITCH / FALLBACK / HELP / INSUFFICIENT plus the active analogy; the bridge maps the decision to a forward-speed ceiling applied to the controller (Efficient = uncapped, Cautious = 0.28, FALLBACK = 0.24, HELP = 0).</w:t>
-      </w:r>
-    </w:p>
-    <w:p>
-      <w:pPr>
-        <w:spacing w:after="100" w:line="276" w:lineRule="auto"/>
-      </w:pPr>
-      <w:r>
-        <w:rPr>
-          <w:b/>
-          <w:color w:val="2E74B5"/>
-          <w:sz w:val="26"/>
-          <w:szCs w:val="26"/>
-        </w:rPr>
-        <w:t xml:space="preserve">3.1  Shared-experience mapping</w:t>
+        <w:t xml:space="preserve">The governance layer is the configuration-first meta-reasoner (Meta-Reasoner 2.0) fed at 2 Hz through a bridge that packages the stack's per-tick telemetry as shared-experience readings. Each tick the reasoner evaluates the candidate analogies (Efficient_Nav / Cautious_Nav) against their QoE boundaries — analogy-level DST intervals, semantic-region memory and direction, tension with attention exponents, fulfillment, required-meta, uncertainty and hard-veto gates — and returns KEEP / SWITCH / FALLBACK / HELP / INSUFFICIENT plus the active analogy. The bridge maps the decision to a forward-speed ceiling (Efficient = uncapped ≈ 0.30 m/s, Cautious = 0.18 m/s, FALLBACK = 0.14 m/s, HELP = 0).</w:t>
       </w:r>
     </w:p>
     <w:tbl>
@@ -455,8 +393,8 @@
               <w:rPr>
                 <w:b/>
                 <w:color w:val="FFFFFF"/>
-                <w:sz w:val="18"/>
-                <w:szCs w:val="18"/>
+                <w:sz w:val="17"/>
+                <w:szCs w:val="17"/>
               </w:rPr>
               <w:t xml:space="preserve">Meta-parameter</w:t>
             </w:r>
@@ -476,8 +414,8 @@
               <w:rPr>
                 <w:b/>
                 <w:color w:val="FFFFFF"/>
-                <w:sz w:val="18"/>
-                <w:szCs w:val="18"/>
+                <w:sz w:val="17"/>
+                <w:szCs w:val="17"/>
               </w:rPr>
               <w:t xml:space="preserve">Source (per-tick telemetry)</w:t>
             </w:r>
@@ -497,8 +435,8 @@
               <w:rPr>
                 <w:b/>
                 <w:color w:val="FFFFFF"/>
-                <w:sz w:val="18"/>
-                <w:szCs w:val="18"/>
+                <w:sz w:val="17"/>
+                <w:szCs w:val="17"/>
               </w:rPr>
               <w:t xml:space="preserve">Role</w:t>
             </w:r>
@@ -517,8 +455,8 @@
             </w:pPr>
             <w:r>
               <w:rPr>
-                <w:sz w:val="18"/>
-                <w:szCs w:val="18"/>
+                <w:sz w:val="17"/>
+                <w:szCs w:val="17"/>
               </w:rPr>
               <w:t xml:space="preserve">safety</w:t>
             </w:r>
@@ -535,10 +473,10 @@
             </w:pPr>
             <w:r>
               <w:rPr>
-                <w:sz w:val="18"/>
-                <w:szCs w:val="18"/>
-              </w:rPr>
-              <w:t xml:space="preserve">clearance = c₀ / 1.5 m (LiDAR forward free space)</w:t>
+                <w:sz w:val="17"/>
+                <w:szCs w:val="17"/>
+              </w:rPr>
+              <w:t xml:space="preserve">clearance = c0 / 1.5 m (LiDAR forward free space)</w:t>
             </w:r>
           </w:p>
         </w:tc>
@@ -553,10 +491,10 @@
             </w:pPr>
             <w:r>
               <w:rPr>
-                <w:sz w:val="18"/>
-                <w:szCs w:val="18"/>
-              </w:rPr>
-              <w:t xml:space="preserve">QoE region + hard veto</w:t>
+                <w:sz w:val="17"/>
+                <w:szCs w:val="17"/>
+              </w:rPr>
+              <w:t xml:space="preserve">QoE regions + hard veto</w:t>
             </w:r>
           </w:p>
         </w:tc>
@@ -573,8 +511,8 @@
             </w:pPr>
             <w:r>
               <w:rPr>
-                <w:sz w:val="18"/>
-                <w:szCs w:val="18"/>
+                <w:sz w:val="17"/>
+                <w:szCs w:val="17"/>
               </w:rPr>
               <w:t xml:space="preserve">progression</w:t>
             </w:r>
@@ -591,8 +529,8 @@
             </w:pPr>
             <w:r>
               <w:rPr>
-                <w:sz w:val="18"/>
-                <w:szCs w:val="18"/>
+                <w:sz w:val="17"/>
+                <w:szCs w:val="17"/>
               </w:rPr>
               <w:t xml:space="preserve">goal-approach rate / 0.30 m/s (2 s window)</w:t>
             </w:r>
@@ -609,8 +547,8 @@
             </w:pPr>
             <w:r>
               <w:rPr>
-                <w:sz w:val="18"/>
-                <w:szCs w:val="18"/>
+                <w:sz w:val="17"/>
+                <w:szCs w:val="17"/>
               </w:rPr>
               <w:t xml:space="preserve">required-meta threshold</w:t>
             </w:r>
@@ -629,8 +567,8 @@
             </w:pPr>
             <w:r>
               <w:rPr>
-                <w:sz w:val="18"/>
-                <w:szCs w:val="18"/>
+                <w:sz w:val="17"/>
+                <w:szCs w:val="17"/>
               </w:rPr>
               <w:t xml:space="preserve">mobility</w:t>
             </w:r>
@@ -647,10 +585,10 @@
             </w:pPr>
             <w:r>
               <w:rPr>
-                <w:sz w:val="18"/>
-                <w:szCs w:val="18"/>
-              </w:rPr>
-              <w:t xml:space="preserve">achieved speed / commanded speed (1.2 s)</w:t>
+                <w:sz w:val="17"/>
+                <w:szCs w:val="17"/>
+              </w:rPr>
+              <w:t xml:space="preserve">achieved / commanded speed (1.2 s window)</w:t>
             </w:r>
           </w:p>
         </w:tc>
@@ -665,8 +603,8 @@
             </w:pPr>
             <w:r>
               <w:rPr>
-                <w:sz w:val="18"/>
-                <w:szCs w:val="18"/>
+                <w:sz w:val="17"/>
+                <w:szCs w:val="17"/>
               </w:rPr>
               <w:t xml:space="preserve">resistance channel, hard veto</w:t>
             </w:r>
@@ -685,8 +623,8 @@
             </w:pPr>
             <w:r>
               <w:rPr>
-                <w:sz w:val="18"/>
-                <w:szCs w:val="18"/>
+                <w:sz w:val="17"/>
+                <w:szCs w:val="17"/>
               </w:rPr>
               <w:t xml:space="preserve">fragility</w:t>
             </w:r>
@@ -703,8 +641,8 @@
             </w:pPr>
             <w:r>
               <w:rPr>
-                <w:sz w:val="18"/>
-                <w:szCs w:val="18"/>
+                <w:sz w:val="17"/>
+                <w:szCs w:val="17"/>
               </w:rPr>
               <w:t xml:space="preserve">payload state: 1.0 intact, drops per spill</w:t>
             </w:r>
@@ -721,8 +659,8 @@
             </w:pPr>
             <w:r>
               <w:rPr>
-                <w:sz w:val="18"/>
-                <w:szCs w:val="18"/>
+                <w:sz w:val="17"/>
+                <w:szCs w:val="17"/>
               </w:rPr>
               <w:t xml:space="preserve">hard veto (payload task)</w:t>
             </w:r>
@@ -741,8 +679,8 @@
             </w:pPr>
             <w:r>
               <w:rPr>
-                <w:sz w:val="18"/>
-                <w:szCs w:val="18"/>
+                <w:sz w:val="17"/>
+                <w:szCs w:val="17"/>
               </w:rPr>
               <w:t xml:space="preserve">reliability / uncertainty</w:t>
             </w:r>
@@ -759,8 +697,8 @@
             </w:pPr>
             <w:r>
               <w:rPr>
-                <w:sz w:val="18"/>
-                <w:szCs w:val="18"/>
+                <w:sz w:val="17"/>
+                <w:szCs w:val="17"/>
               </w:rPr>
               <w:t xml:space="preserve">sensing monitor + few-shot historical margin</w:t>
             </w:r>
@@ -777,8 +715,8 @@
             </w:pPr>
             <w:r>
               <w:rPr>
-                <w:sz w:val="18"/>
-                <w:szCs w:val="18"/>
+                <w:sz w:val="17"/>
+                <w:szCs w:val="17"/>
               </w:rPr>
               <w:t xml:space="preserve">DST belief interval</w:t>
             </w:r>
@@ -791,7 +729,7 @@
         <w:spacing w:after="120" w:line="276" w:lineRule="auto"/>
       </w:pPr>
       <w:r>
-        <w:t xml:space="preserve">Readings are median-smoothed over ~2.5 s; each reading's DST uncertainty adds the historical dispersion of its own metric (few-shot margin), so a value oscillating across a QoE boundary widens its belief/plausibility interval and cannot be certified on a single lucky sample. Switches are hysteretic (confirmed after 3 consecutive winners, released more slowly). An experience-escalation layer aborts the run when HELP is sustained (≥ 8 s) or a 75 s window shows ≥ 60% FALLBACK/HELP with &lt; 0.4 m net progress — the runtime's specified “request intervention” semantics.</w:t>
+        <w:t xml:space="preserve">Readings are median-smoothed (~2.5 s) and each reading's DST uncertainty adds the historical dispersion of its own metric (few-shot margin). Switches are hysteretic; an experience-escalation layer aborts on sustained HELP (≥ 8 s, scaled ×2 for the twin's ≈ 0.5 real-time factor) or a stagnant high-FALLBACK window.</w:t>
       </w:r>
     </w:p>
     <w:p>
@@ -805,7 +743,7 @@
           <w:sz w:val="26"/>
           <w:szCs w:val="26"/>
         </w:rPr>
-        <w:t xml:space="preserve">3.2  Two-layer trust (thesis Ch. 5 realised on the G1)</w:t>
+        <w:t xml:space="preserve">3.1  Two-layer trust (thesis Ch. 5 realised on the G1)</w:t>
       </w:r>
     </w:p>
     <w:p>
@@ -819,7 +757,7 @@
         <w:t xml:space="preserve">Intra-run (fragility channel).</w:t>
       </w:r>
       <w:r>
-        <w:t xml:space="preserve"> Each spill — from the sim model or the human mark — drives the fragility meta-parameter: one spill lowers it to caution, two to FALLBACK, three or more into the dangerous region where the hard veto forces HELP; it recovers on a ~25 s time constant if no further spill occurs. A spill is treated as a certain event, not a noisy sensor reading.</w:t>
+        <w:t xml:space="preserve"> Each spill drives the fragility meta-parameter: one spill lowers it to caution (≈ 0.52), two to the FALLBACK band (≈ 0.31), three or more into the dangerous region (&lt; 0.12) where the hard veto forces HELP; recovery follows a ~25 s time constant. A spill is a certain event, not a noisy sensor reading, so it bypasses median smoothing.</w:t>
       </w:r>
     </w:p>
     <w:p>
@@ -833,7 +771,15 @@
         <w:t xml:space="preserve">Cross-run (Layer 2).</w:t>
       </w:r>
       <w:r>
-        <w:t xml:space="preserve"> A per-analogy Dempster–Shafer belief over {match, mismatch, Θ} is persisted between runs. At each run's end the outcome is fused by Dempster's rule — a spill under analogy A adds mass to A's mismatch; a clean run adds match to the governing analogy. The plausibility Pl = m_match + m_Θ then gates deployment: below 0.70 the analogy's speed ceiling is blended toward the conservative policy (the thesis policy blend), below 0.45 the analogy is not deployed and a discredited initial prior is replaced at start-up. In a controlled test this reproduces the thesis M2+Wrong→DST recovery: Pl(Efficient) degrades 1.00 → 0.75 → 0.53 → 0.36 over three spill runs and the fourth run starts pre-corrected. The reasoner itself is untouched; both layers live in the bridge.</w:t>
+        <w:t xml:space="preserve"> A per-analogy Dempster–Shafer belief over {match, mismatch, Θ} is persisted between runs. At each run's end, outcome evidence is fused by Dempster's rule: a spill under analogy A adds mismatch mass to A; a clean run adds match mass to the governing analogy. Plausibility Pl = m(match) + m(Θ) gates deployment: below 0.70 the analogy's ceiling is blended toward the conservative policy (the thesis policy blend); below 0.45 it is not deployed, and a discredited initial prior is replaced at start-up (zero-shot correction). The reasoner itself is untouched; both layers live in the bridge.</w:t>
+      </w:r>
+    </w:p>
+    <w:p>
+      <w:pPr>
+        <w:spacing w:after="120"/>
+      </w:pPr>
+      <w:r>
+        <w:br w:type="page"/>
       </w:r>
     </w:p>
     <w:p>
@@ -855,15 +801,7 @@
         <w:spacing w:after="160" w:line="276" w:lineRule="auto"/>
       </w:pPr>
       <w:r>
-        <w:t xml:space="preserve">Each run resets Gazebo to a fresh world with the robot at waypoint A, then executes an autonomous A→B traverse headless with a timeout (a SIGINT saves the dataset exactly as a manual stop would). Governance arms are alternated so drift in machine load is shared across conditions. Arms are selected by environment configuration; every run is tagged env=sim with a per-arm identifier, and the aggregation script reports mean ± 95% CI (1.96·s/√n, matching the thesis protocol), reached/abort rates, and — for the cross-run arms — the per-run recovery sequence with the final Layer-2 belief state. Datasets, the aggregation script, and the exact configurations are versioned with the code.</w:t>
-      </w:r>
-    </w:p>
-    <w:p>
-      <w:pPr>
-        <w:spacing w:after="120"/>
-      </w:pPr>
-      <w:r>
-        <w:br w:type="page"/>
+        <w:t xml:space="preserve">99 simulation runs were executed in total: 82 valid formal-campaign runs across 11 governance arms (8 per arm; 6 for sealed-lid arms), plus development and validation runs (adapter bring-up, collision-physics correction, smoke tests) and one run excluded by audit (governance silently disabled by a mid-campaign code edit — detected by a per-tick telemetry check and discarded). Every run resets Gazebo to a fresh world with the robot at waypoint A and executes an autonomous A→B traverse headless; arms alternate to share machine-load drift; datasets are tagged env=sim with a per-arm identifier. Statistics follow the thesis protocol: mean ± 95% CI (1.96·s/√n).</w:t>
       </w:r>
     </w:p>
     <w:p>
@@ -885,12 +823,12 @@
         <w:spacing w:after="160" w:line="276" w:lineRule="auto"/>
       </w:pPr>
       <w:r>
-        <w:t xml:space="preserve">Governance arms (N = 8 runs each; sealed-lid arms N = 6; mean ± 95% CI). Risk is the fraction of run time with the liquid surface above 70% of freeboard; HELP is a governed abort following a sustained empty deployable set.</w:t>
+        <w:t xml:space="preserve">Table 1 reports all eleven arms. Risk is the fraction of run time with the liquid surface above 70% of freeboard; HELP counts governed aborts (sustained empty deployable set); times average reached runs only.</w:t>
       </w:r>
     </w:p>
     <w:tbl>
       <w:tblPr>
-        <w:tblW w:w="8600" w:type="dxa"/>
+        <w:tblW w:w="8700" w:type="dxa"/>
         <w:tblBorders>
           <w:top w:val="single" w:sz="4" w:color="8EAADB"/>
           <w:left w:val="single" w:sz="4" w:color="8EAADB"/>
@@ -901,16 +839,17 @@
         </w:tblBorders>
       </w:tblPr>
       <w:tblGrid>
-        <w:gridCol w:w="3000"/>
+        <w:gridCol w:w="2050"/>
+        <w:gridCol w:w="1800"/>
+        <w:gridCol w:w="1250"/>
         <w:gridCol w:w="1300"/>
-        <w:gridCol w:w="1550"/>
-        <w:gridCol w:w="1550"/>
-        <w:gridCol w:w="1200"/>
+        <w:gridCol w:w="1300"/>
+        <w:gridCol w:w="1000"/>
       </w:tblGrid>
       <w:tr>
         <w:tc>
           <w:tcPr>
-            <w:tcW w:w="3000" w:type="dxa"/>
+            <w:tcW w:w="2050" w:type="dxa"/>
             <w:shd w:val="clear" w:color="auto" w:fill="1F3864"/>
             <w:vAlign w:val="center"/>
           </w:tcPr>
@@ -922,10 +861,52 @@
               <w:rPr>
                 <w:b/>
                 <w:color w:val="FFFFFF"/>
-                <w:sz w:val="18"/>
-                <w:szCs w:val="18"/>
-              </w:rPr>
-              <w:t xml:space="preserve">Arm / governance</w:t>
+                <w:sz w:val="17"/>
+                <w:szCs w:val="17"/>
+              </w:rPr>
+              <w:t xml:space="preserve">Arm</w:t>
+            </w:r>
+          </w:p>
+        </w:tc>
+        <w:tc>
+          <w:tcPr>
+            <w:tcW w:w="1800" w:type="dxa"/>
+            <w:shd w:val="clear" w:color="auto" w:fill="1F3864"/>
+            <w:vAlign w:val="center"/>
+          </w:tcPr>
+          <w:p>
+            <w:pPr>
+              <w:spacing w:after="30"/>
+            </w:pPr>
+            <w:r>
+              <w:rPr>
+                <w:b/>
+                <w:color w:val="FFFFFF"/>
+                <w:sz w:val="17"/>
+                <w:szCs w:val="17"/>
+              </w:rPr>
+              <w:t xml:space="preserve">Governance</w:t>
+            </w:r>
+          </w:p>
+        </w:tc>
+        <w:tc>
+          <w:tcPr>
+            <w:tcW w:w="1250" w:type="dxa"/>
+            <w:shd w:val="clear" w:color="auto" w:fill="1F3864"/>
+            <w:vAlign w:val="center"/>
+          </w:tcPr>
+          <w:p>
+            <w:pPr>
+              <w:spacing w:after="30"/>
+            </w:pPr>
+            <w:r>
+              <w:rPr>
+                <w:b/>
+                <w:color w:val="FFFFFF"/>
+                <w:sz w:val="17"/>
+                <w:szCs w:val="17"/>
+              </w:rPr>
+              <w:t xml:space="preserve">Reached</w:t>
             </w:r>
           </w:p>
         </w:tc>
@@ -943,16 +924,16 @@
               <w:rPr>
                 <w:b/>
                 <w:color w:val="FFFFFF"/>
-                <w:sz w:val="18"/>
-                <w:szCs w:val="18"/>
-              </w:rPr>
-              <w:t xml:space="preserve">Reached</w:t>
-            </w:r>
-          </w:p>
-        </w:tc>
-        <w:tc>
-          <w:tcPr>
-            <w:tcW w:w="1550" w:type="dxa"/>
+                <w:sz w:val="17"/>
+                <w:szCs w:val="17"/>
+              </w:rPr>
+              <w:t xml:space="preserve">Time (s)</w:t>
+            </w:r>
+          </w:p>
+        </w:tc>
+        <w:tc>
+          <w:tcPr>
+            <w:tcW w:w="1300" w:type="dxa"/>
             <w:shd w:val="clear" w:color="auto" w:fill="1F3864"/>
             <w:vAlign w:val="center"/>
           </w:tcPr>
@@ -964,16 +945,16 @@
               <w:rPr>
                 <w:b/>
                 <w:color w:val="FFFFFF"/>
-                <w:sz w:val="18"/>
-                <w:szCs w:val="18"/>
-              </w:rPr>
-              <w:t xml:space="preserve">Time (s)</w:t>
-            </w:r>
-          </w:p>
-        </w:tc>
-        <w:tc>
-          <w:tcPr>
-            <w:tcW w:w="1550" w:type="dxa"/>
+                <w:sz w:val="17"/>
+                <w:szCs w:val="17"/>
+              </w:rPr>
+              <w:t xml:space="preserve">Spills/run</w:t>
+            </w:r>
+          </w:p>
+        </w:tc>
+        <w:tc>
+          <w:tcPr>
+            <w:tcW w:w="1000" w:type="dxa"/>
             <w:shd w:val="clear" w:color="auto" w:fill="1F3864"/>
             <w:vAlign w:val="center"/>
           </w:tcPr>
@@ -985,29 +966,8 @@
               <w:rPr>
                 <w:b/>
                 <w:color w:val="FFFFFF"/>
-                <w:sz w:val="18"/>
-                <w:szCs w:val="18"/>
-              </w:rPr>
-              <w:t xml:space="preserve">Spills/run</w:t>
-            </w:r>
-          </w:p>
-        </w:tc>
-        <w:tc>
-          <w:tcPr>
-            <w:tcW w:w="1200" w:type="dxa"/>
-            <w:shd w:val="clear" w:color="auto" w:fill="1F3864"/>
-            <w:vAlign w:val="center"/>
-          </w:tcPr>
-          <w:p>
-            <w:pPr>
-              <w:spacing w:after="30"/>
-            </w:pPr>
-            <w:r>
-              <w:rPr>
-                <w:b/>
-                <w:color w:val="FFFFFF"/>
-                <w:sz w:val="18"/>
-                <w:szCs w:val="18"/>
+                <w:sz w:val="17"/>
+                <w:szCs w:val="17"/>
               </w:rPr>
               <w:t xml:space="preserve">Risk (%)</w:t>
             </w:r>
@@ -1017,7 +977,7 @@
       <w:tr>
         <w:tc>
           <w:tcPr>
-            <w:tcW w:w="3000" w:type="dxa"/>
+            <w:tcW w:w="2050" w:type="dxa"/>
             <w:vAlign w:val="center"/>
           </w:tcPr>
           <w:p>
@@ -1027,10 +987,46 @@
             <w:r>
               <w:rPr>
                 <w:b/>
-                <w:sz w:val="18"/>
-                <w:szCs w:val="18"/>
-              </w:rPr>
-              <w:t xml:space="preserve">M0 baseline — none (0.30 m/s)</w:t>
+                <w:sz w:val="17"/>
+                <w:szCs w:val="17"/>
+              </w:rPr>
+              <w:t xml:space="preserve">M0 baseline</w:t>
+            </w:r>
+          </w:p>
+        </w:tc>
+        <w:tc>
+          <w:tcPr>
+            <w:tcW w:w="1800" w:type="dxa"/>
+            <w:vAlign w:val="center"/>
+          </w:tcPr>
+          <w:p>
+            <w:pPr>
+              <w:spacing w:after="30"/>
+            </w:pPr>
+            <w:r>
+              <w:rPr>
+                <w:sz w:val="17"/>
+                <w:szCs w:val="17"/>
+              </w:rPr>
+              <w:t xml:space="preserve">none (0.30 m/s)</w:t>
+            </w:r>
+          </w:p>
+        </w:tc>
+        <w:tc>
+          <w:tcPr>
+            <w:tcW w:w="1250" w:type="dxa"/>
+            <w:vAlign w:val="center"/>
+          </w:tcPr>
+          <w:p>
+            <w:pPr>
+              <w:spacing w:after="30"/>
+            </w:pPr>
+            <w:r>
+              <w:rPr>
+                <w:sz w:val="17"/>
+                <w:szCs w:val="17"/>
+              </w:rPr>
+              <w:t xml:space="preserve">8/8</w:t>
             </w:r>
           </w:p>
         </w:tc>
@@ -1045,26 +1041,8 @@
             </w:pPr>
             <w:r>
               <w:rPr>
-                <w:sz w:val="18"/>
-                <w:szCs w:val="18"/>
-              </w:rPr>
-              <w:t xml:space="preserve">8/8</w:t>
-            </w:r>
-          </w:p>
-        </w:tc>
-        <w:tc>
-          <w:tcPr>
-            <w:tcW w:w="1550" w:type="dxa"/>
-            <w:vAlign w:val="center"/>
-          </w:tcPr>
-          <w:p>
-            <w:pPr>
-              <w:spacing w:after="30"/>
-            </w:pPr>
-            <w:r>
-              <w:rPr>
-                <w:sz w:val="18"/>
-                <w:szCs w:val="18"/>
+                <w:sz w:val="17"/>
+                <w:szCs w:val="17"/>
               </w:rPr>
               <w:t xml:space="preserve">83.4 ± 5.2</w:t>
             </w:r>
@@ -1072,17 +1050,17 @@
         </w:tc>
         <w:tc>
           <w:tcPr>
-            <w:tcW w:w="1550" w:type="dxa"/>
-            <w:vAlign w:val="center"/>
-          </w:tcPr>
-          <w:p>
-            <w:pPr>
-              <w:spacing w:after="30"/>
-            </w:pPr>
-            <w:r>
-              <w:rPr>
-                <w:sz w:val="18"/>
-                <w:szCs w:val="18"/>
+            <w:tcW w:w="1300" w:type="dxa"/>
+            <w:vAlign w:val="center"/>
+          </w:tcPr>
+          <w:p>
+            <w:pPr>
+              <w:spacing w:after="30"/>
+            </w:pPr>
+            <w:r>
+              <w:rPr>
+                <w:sz w:val="17"/>
+                <w:szCs w:val="17"/>
               </w:rPr>
               <w:t xml:space="preserve">0.50 ± 0.37</w:t>
             </w:r>
@@ -1090,17 +1068,17 @@
         </w:tc>
         <w:tc>
           <w:tcPr>
-            <w:tcW w:w="1200" w:type="dxa"/>
-            <w:vAlign w:val="center"/>
-          </w:tcPr>
-          <w:p>
-            <w:pPr>
-              <w:spacing w:after="30"/>
-            </w:pPr>
-            <w:r>
-              <w:rPr>
-                <w:sz w:val="18"/>
-                <w:szCs w:val="18"/>
+            <w:tcW w:w="1000" w:type="dxa"/>
+            <w:vAlign w:val="center"/>
+          </w:tcPr>
+          <w:p>
+            <w:pPr>
+              <w:spacing w:after="30"/>
+            </w:pPr>
+            <w:r>
+              <w:rPr>
+                <w:sz w:val="17"/>
+                <w:szCs w:val="17"/>
               </w:rPr>
               <w:t xml:space="preserve">8.1 ± 1.4</w:t>
             </w:r>
@@ -1110,7 +1088,7 @@
       <w:tr>
         <w:tc>
           <w:tcPr>
-            <w:tcW w:w="3000" w:type="dxa"/>
+            <w:tcW w:w="2050" w:type="dxa"/>
             <w:vAlign w:val="center"/>
           </w:tcPr>
           <w:p>
@@ -1120,10 +1098,46 @@
             <w:r>
               <w:rPr>
                 <w:b/>
-                <w:sz w:val="18"/>
-                <w:szCs w:val="18"/>
-              </w:rPr>
-              <w:t xml:space="preserve">M1 fixed-conservative — none (0.18 cap)</w:t>
+                <w:sz w:val="17"/>
+                <w:szCs w:val="17"/>
+              </w:rPr>
+              <w:t xml:space="preserve">M1 fixed-conservative</w:t>
+            </w:r>
+          </w:p>
+        </w:tc>
+        <w:tc>
+          <w:tcPr>
+            <w:tcW w:w="1800" w:type="dxa"/>
+            <w:vAlign w:val="center"/>
+          </w:tcPr>
+          <w:p>
+            <w:pPr>
+              <w:spacing w:after="30"/>
+            </w:pPr>
+            <w:r>
+              <w:rPr>
+                <w:sz w:val="17"/>
+                <w:szCs w:val="17"/>
+              </w:rPr>
+              <w:t xml:space="preserve">none (0.18 m/s cap)</w:t>
+            </w:r>
+          </w:p>
+        </w:tc>
+        <w:tc>
+          <w:tcPr>
+            <w:tcW w:w="1250" w:type="dxa"/>
+            <w:vAlign w:val="center"/>
+          </w:tcPr>
+          <w:p>
+            <w:pPr>
+              <w:spacing w:after="30"/>
+            </w:pPr>
+            <w:r>
+              <w:rPr>
+                <w:sz w:val="17"/>
+                <w:szCs w:val="17"/>
+              </w:rPr>
+              <w:t xml:space="preserve">8/8</w:t>
             </w:r>
           </w:p>
         </w:tc>
@@ -1138,26 +1152,8 @@
             </w:pPr>
             <w:r>
               <w:rPr>
-                <w:sz w:val="18"/>
-                <w:szCs w:val="18"/>
-              </w:rPr>
-              <w:t xml:space="preserve">8/8</w:t>
-            </w:r>
-          </w:p>
-        </w:tc>
-        <w:tc>
-          <w:tcPr>
-            <w:tcW w:w="1550" w:type="dxa"/>
-            <w:vAlign w:val="center"/>
-          </w:tcPr>
-          <w:p>
-            <w:pPr>
-              <w:spacing w:after="30"/>
-            </w:pPr>
-            <w:r>
-              <w:rPr>
-                <w:sz w:val="18"/>
-                <w:szCs w:val="18"/>
+                <w:sz w:val="17"/>
+                <w:szCs w:val="17"/>
               </w:rPr>
               <w:t xml:space="preserve">110.8 ± 2.4</w:t>
             </w:r>
@@ -1165,17 +1161,17 @@
         </w:tc>
         <w:tc>
           <w:tcPr>
-            <w:tcW w:w="1550" w:type="dxa"/>
-            <w:vAlign w:val="center"/>
-          </w:tcPr>
-          <w:p>
-            <w:pPr>
-              <w:spacing w:after="30"/>
-            </w:pPr>
-            <w:r>
-              <w:rPr>
-                <w:sz w:val="18"/>
-                <w:szCs w:val="18"/>
+            <w:tcW w:w="1300" w:type="dxa"/>
+            <w:vAlign w:val="center"/>
+          </w:tcPr>
+          <w:p>
+            <w:pPr>
+              <w:spacing w:after="30"/>
+            </w:pPr>
+            <w:r>
+              <w:rPr>
+                <w:sz w:val="17"/>
+                <w:szCs w:val="17"/>
               </w:rPr>
               <w:t xml:space="preserve">0.00</w:t>
             </w:r>
@@ -1183,17 +1179,17 @@
         </w:tc>
         <w:tc>
           <w:tcPr>
-            <w:tcW w:w="1200" w:type="dxa"/>
-            <w:vAlign w:val="center"/>
-          </w:tcPr>
-          <w:p>
-            <w:pPr>
-              <w:spacing w:after="30"/>
-            </w:pPr>
-            <w:r>
-              <w:rPr>
-                <w:sz w:val="18"/>
-                <w:szCs w:val="18"/>
+            <w:tcW w:w="1000" w:type="dxa"/>
+            <w:vAlign w:val="center"/>
+          </w:tcPr>
+          <w:p>
+            <w:pPr>
+              <w:spacing w:after="30"/>
+            </w:pPr>
+            <w:r>
+              <w:rPr>
+                <w:sz w:val="17"/>
+                <w:szCs w:val="17"/>
               </w:rPr>
               <w:t xml:space="preserve">0.8 ± 0.2</w:t>
             </w:r>
@@ -1203,7 +1199,7 @@
       <w:tr>
         <w:tc>
           <w:tcPr>
-            <w:tcW w:w="3000" w:type="dxa"/>
+            <w:tcW w:w="2050" w:type="dxa"/>
             <w:vAlign w:val="center"/>
           </w:tcPr>
           <w:p>
@@ -1213,8 +1209,8 @@
             <w:r>
               <w:rPr>
                 <w:b/>
-                <w:sz w:val="18"/>
-                <w:szCs w:val="18"/>
+                <w:sz w:val="17"/>
+                <w:szCs w:val="17"/>
               </w:rPr>
               <w:t xml:space="preserve">Single-candidate governed</w:t>
             </w:r>
@@ -1222,6 +1218,42 @@
         </w:tc>
         <w:tc>
           <w:tcPr>
+            <w:tcW w:w="1800" w:type="dxa"/>
+            <w:vAlign w:val="center"/>
+          </w:tcPr>
+          <w:p>
+            <w:pPr>
+              <w:spacing w:after="30"/>
+            </w:pPr>
+            <w:r>
+              <w:rPr>
+                <w:sz w:val="17"/>
+                <w:szCs w:val="17"/>
+              </w:rPr>
+              <w:t xml:space="preserve">DCE, one analogy</w:t>
+            </w:r>
+          </w:p>
+        </w:tc>
+        <w:tc>
+          <w:tcPr>
+            <w:tcW w:w="1250" w:type="dxa"/>
+            <w:vAlign w:val="center"/>
+          </w:tcPr>
+          <w:p>
+            <w:pPr>
+              <w:spacing w:after="30"/>
+            </w:pPr>
+            <w:r>
+              <w:rPr>
+                <w:sz w:val="17"/>
+                <w:szCs w:val="17"/>
+              </w:rPr>
+              <w:t xml:space="preserve">5/8 (3 HELP)</w:t>
+            </w:r>
+          </w:p>
+        </w:tc>
+        <w:tc>
+          <w:tcPr>
             <w:tcW w:w="1300" w:type="dxa"/>
             <w:vAlign w:val="center"/>
           </w:tcPr>
@@ -1231,26 +1263,8 @@
             </w:pPr>
             <w:r>
               <w:rPr>
-                <w:sz w:val="18"/>
-                <w:szCs w:val="18"/>
-              </w:rPr>
-              <w:t xml:space="preserve">5/8 (3 HELP)</w:t>
-            </w:r>
-          </w:p>
-        </w:tc>
-        <w:tc>
-          <w:tcPr>
-            <w:tcW w:w="1550" w:type="dxa"/>
-            <w:vAlign w:val="center"/>
-          </w:tcPr>
-          <w:p>
-            <w:pPr>
-              <w:spacing w:after="30"/>
-            </w:pPr>
-            <w:r>
-              <w:rPr>
-                <w:sz w:val="18"/>
-                <w:szCs w:val="18"/>
+                <w:sz w:val="17"/>
+                <w:szCs w:val="17"/>
               </w:rPr>
               <w:t xml:space="preserve">106.2 ± 5.1</w:t>
             </w:r>
@@ -1258,17 +1272,17 @@
         </w:tc>
         <w:tc>
           <w:tcPr>
-            <w:tcW w:w="1550" w:type="dxa"/>
-            <w:vAlign w:val="center"/>
-          </w:tcPr>
-          <w:p>
-            <w:pPr>
-              <w:spacing w:after="30"/>
-            </w:pPr>
-            <w:r>
-              <w:rPr>
-                <w:sz w:val="18"/>
-                <w:szCs w:val="18"/>
+            <w:tcW w:w="1300" w:type="dxa"/>
+            <w:vAlign w:val="center"/>
+          </w:tcPr>
+          <w:p>
+            <w:pPr>
+              <w:spacing w:after="30"/>
+            </w:pPr>
+            <w:r>
+              <w:rPr>
+                <w:sz w:val="17"/>
+                <w:szCs w:val="17"/>
               </w:rPr>
               <w:t xml:space="preserve">0.12 ± 0.24</w:t>
             </w:r>
@@ -1276,17 +1290,17 @@
         </w:tc>
         <w:tc>
           <w:tcPr>
-            <w:tcW w:w="1200" w:type="dxa"/>
-            <w:vAlign w:val="center"/>
-          </w:tcPr>
-          <w:p>
-            <w:pPr>
-              <w:spacing w:after="30"/>
-            </w:pPr>
-            <w:r>
-              <w:rPr>
-                <w:sz w:val="18"/>
-                <w:szCs w:val="18"/>
+            <w:tcW w:w="1000" w:type="dxa"/>
+            <w:vAlign w:val="center"/>
+          </w:tcPr>
+          <w:p>
+            <w:pPr>
+              <w:spacing w:after="30"/>
+            </w:pPr>
+            <w:r>
+              <w:rPr>
+                <w:sz w:val="17"/>
+                <w:szCs w:val="17"/>
               </w:rPr>
               <w:t xml:space="preserve">0.5 ± 0.2</w:t>
             </w:r>
@@ -1296,7 +1310,7 @@
       <w:tr>
         <w:tc>
           <w:tcPr>
-            <w:tcW w:w="3000" w:type="dxa"/>
+            <w:tcW w:w="2050" w:type="dxa"/>
             <w:vAlign w:val="center"/>
           </w:tcPr>
           <w:p>
@@ -1306,8 +1320,8 @@
             <w:r>
               <w:rPr>
                 <w:b/>
-                <w:sz w:val="18"/>
-                <w:szCs w:val="18"/>
+                <w:sz w:val="17"/>
+                <w:szCs w:val="17"/>
               </w:rPr>
               <w:t xml:space="preserve">M2 payload (proposed)</w:t>
             </w:r>
@@ -1315,6 +1329,42 @@
         </w:tc>
         <w:tc>
           <w:tcPr>
+            <w:tcW w:w="1800" w:type="dxa"/>
+            <w:vAlign w:val="center"/>
+          </w:tcPr>
+          <w:p>
+            <w:pPr>
+              <w:spacing w:after="30"/>
+            </w:pPr>
+            <w:r>
+              <w:rPr>
+                <w:sz w:val="17"/>
+                <w:szCs w:val="17"/>
+              </w:rPr>
+              <w:t xml:space="preserve">DCE, payload task</w:t>
+            </w:r>
+          </w:p>
+        </w:tc>
+        <w:tc>
+          <w:tcPr>
+            <w:tcW w:w="1250" w:type="dxa"/>
+            <w:vAlign w:val="center"/>
+          </w:tcPr>
+          <w:p>
+            <w:pPr>
+              <w:spacing w:after="30"/>
+            </w:pPr>
+            <w:r>
+              <w:rPr>
+                <w:sz w:val="17"/>
+                <w:szCs w:val="17"/>
+              </w:rPr>
+              <w:t xml:space="preserve">8/8</w:t>
+            </w:r>
+          </w:p>
+        </w:tc>
+        <w:tc>
+          <w:tcPr>
             <w:tcW w:w="1300" w:type="dxa"/>
             <w:vAlign w:val="center"/>
           </w:tcPr>
@@ -1324,26 +1374,8 @@
             </w:pPr>
             <w:r>
               <w:rPr>
-                <w:sz w:val="18"/>
-                <w:szCs w:val="18"/>
-              </w:rPr>
-              <w:t xml:space="preserve">8/8</w:t>
-            </w:r>
-          </w:p>
-        </w:tc>
-        <w:tc>
-          <w:tcPr>
-            <w:tcW w:w="1550" w:type="dxa"/>
-            <w:vAlign w:val="center"/>
-          </w:tcPr>
-          <w:p>
-            <w:pPr>
-              <w:spacing w:after="30"/>
-            </w:pPr>
-            <w:r>
-              <w:rPr>
-                <w:sz w:val="18"/>
-                <w:szCs w:val="18"/>
+                <w:sz w:val="17"/>
+                <w:szCs w:val="17"/>
               </w:rPr>
               <w:t xml:space="preserve">107.9 ± 4.2</w:t>
             </w:r>
@@ -1351,17 +1383,17 @@
         </w:tc>
         <w:tc>
           <w:tcPr>
-            <w:tcW w:w="1550" w:type="dxa"/>
-            <w:vAlign w:val="center"/>
-          </w:tcPr>
-          <w:p>
-            <w:pPr>
-              <w:spacing w:after="30"/>
-            </w:pPr>
-            <w:r>
-              <w:rPr>
-                <w:sz w:val="18"/>
-                <w:szCs w:val="18"/>
+            <w:tcW w:w="1300" w:type="dxa"/>
+            <w:vAlign w:val="center"/>
+          </w:tcPr>
+          <w:p>
+            <w:pPr>
+              <w:spacing w:after="30"/>
+            </w:pPr>
+            <w:r>
+              <w:rPr>
+                <w:sz w:val="17"/>
+                <w:szCs w:val="17"/>
               </w:rPr>
               <w:t xml:space="preserve">0.00</w:t>
             </w:r>
@@ -1369,17 +1401,17 @@
         </w:tc>
         <w:tc>
           <w:tcPr>
-            <w:tcW w:w="1200" w:type="dxa"/>
-            <w:vAlign w:val="center"/>
-          </w:tcPr>
-          <w:p>
-            <w:pPr>
-              <w:spacing w:after="30"/>
-            </w:pPr>
-            <w:r>
-              <w:rPr>
-                <w:sz w:val="18"/>
-                <w:szCs w:val="18"/>
+            <w:tcW w:w="1000" w:type="dxa"/>
+            <w:vAlign w:val="center"/>
+          </w:tcPr>
+          <w:p>
+            <w:pPr>
+              <w:spacing w:after="30"/>
+            </w:pPr>
+            <w:r>
+              <w:rPr>
+                <w:sz w:val="17"/>
+                <w:szCs w:val="17"/>
               </w:rPr>
               <w:t xml:space="preserve">0.4 ± 0.2</w:t>
             </w:r>
@@ -1389,7 +1421,7 @@
       <w:tr>
         <w:tc>
           <w:tcPr>
-            <w:tcW w:w="3000" w:type="dxa"/>
+            <w:tcW w:w="2050" w:type="dxa"/>
             <w:vAlign w:val="center"/>
           </w:tcPr>
           <w:p>
@@ -1399,10 +1431,46 @@
             <w:r>
               <w:rPr>
                 <w:b/>
-                <w:sz w:val="18"/>
-                <w:szCs w:val="18"/>
-              </w:rPr>
-              <w:t xml:space="preserve">M2 + task-blind prior</w:t>
+                <w:sz w:val="17"/>
+                <w:szCs w:val="17"/>
+              </w:rPr>
+              <w:t xml:space="preserve">M2 task-blind prior</w:t>
+            </w:r>
+          </w:p>
+        </w:tc>
+        <w:tc>
+          <w:tcPr>
+            <w:tcW w:w="1800" w:type="dxa"/>
+            <w:vAlign w:val="center"/>
+          </w:tcPr>
+          <w:p>
+            <w:pPr>
+              <w:spacing w:after="30"/>
+            </w:pPr>
+            <w:r>
+              <w:rPr>
+                <w:sz w:val="17"/>
+                <w:szCs w:val="17"/>
+              </w:rPr>
+              <w:t xml:space="preserve">DCE, lab-QoE config</w:t>
+            </w:r>
+          </w:p>
+        </w:tc>
+        <w:tc>
+          <w:tcPr>
+            <w:tcW w:w="1250" w:type="dxa"/>
+            <w:vAlign w:val="center"/>
+          </w:tcPr>
+          <w:p>
+            <w:pPr>
+              <w:spacing w:after="30"/>
+            </w:pPr>
+            <w:r>
+              <w:rPr>
+                <w:sz w:val="17"/>
+                <w:szCs w:val="17"/>
+              </w:rPr>
+              <w:t xml:space="preserve">8/8</w:t>
             </w:r>
           </w:p>
         </w:tc>
@@ -1417,26 +1485,8 @@
             </w:pPr>
             <w:r>
               <w:rPr>
-                <w:sz w:val="18"/>
-                <w:szCs w:val="18"/>
-              </w:rPr>
-              <w:t xml:space="preserve">8/8</w:t>
-            </w:r>
-          </w:p>
-        </w:tc>
-        <w:tc>
-          <w:tcPr>
-            <w:tcW w:w="1550" w:type="dxa"/>
-            <w:vAlign w:val="center"/>
-          </w:tcPr>
-          <w:p>
-            <w:pPr>
-              <w:spacing w:after="30"/>
-            </w:pPr>
-            <w:r>
-              <w:rPr>
-                <w:sz w:val="18"/>
-                <w:szCs w:val="18"/>
+                <w:sz w:val="17"/>
+                <w:szCs w:val="17"/>
               </w:rPr>
               <w:t xml:space="preserve">108.2 ± 3.5</w:t>
             </w:r>
@@ -1444,17 +1494,17 @@
         </w:tc>
         <w:tc>
           <w:tcPr>
-            <w:tcW w:w="1550" w:type="dxa"/>
-            <w:vAlign w:val="center"/>
-          </w:tcPr>
-          <w:p>
-            <w:pPr>
-              <w:spacing w:after="30"/>
-            </w:pPr>
-            <w:r>
-              <w:rPr>
-                <w:sz w:val="18"/>
-                <w:szCs w:val="18"/>
+            <w:tcW w:w="1300" w:type="dxa"/>
+            <w:vAlign w:val="center"/>
+          </w:tcPr>
+          <w:p>
+            <w:pPr>
+              <w:spacing w:after="30"/>
+            </w:pPr>
+            <w:r>
+              <w:rPr>
+                <w:sz w:val="17"/>
+                <w:szCs w:val="17"/>
               </w:rPr>
               <w:t xml:space="preserve">0.00</w:t>
             </w:r>
@@ -1462,17 +1512,17 @@
         </w:tc>
         <w:tc>
           <w:tcPr>
-            <w:tcW w:w="1200" w:type="dxa"/>
-            <w:vAlign w:val="center"/>
-          </w:tcPr>
-          <w:p>
-            <w:pPr>
-              <w:spacing w:after="30"/>
-            </w:pPr>
-            <w:r>
-              <w:rPr>
-                <w:sz w:val="18"/>
-                <w:szCs w:val="18"/>
+            <w:tcW w:w="1000" w:type="dxa"/>
+            <w:vAlign w:val="center"/>
+          </w:tcPr>
+          <w:p>
+            <w:pPr>
+              <w:spacing w:after="30"/>
+            </w:pPr>
+            <w:r>
+              <w:rPr>
+                <w:sz w:val="17"/>
+                <w:szCs w:val="17"/>
               </w:rPr>
               <w:t xml:space="preserve">0.7 ± 0.2</w:t>
             </w:r>
@@ -1482,7 +1532,7 @@
       <w:tr>
         <w:tc>
           <w:tcPr>
-            <w:tcW w:w="3000" w:type="dxa"/>
+            <w:tcW w:w="2050" w:type="dxa"/>
             <w:vAlign w:val="center"/>
           </w:tcPr>
           <w:p>
@@ -1492,10 +1542,46 @@
             <w:r>
               <w:rPr>
                 <w:b/>
-                <w:sz w:val="18"/>
-                <w:szCs w:val="18"/>
-              </w:rPr>
-              <w:t xml:space="preserve">M0, sealed lid</w:t>
+                <w:sz w:val="17"/>
+                <w:szCs w:val="17"/>
+              </w:rPr>
+              <w:t xml:space="preserve">M2 task-blind (twin-cal.)</w:t>
+            </w:r>
+          </w:p>
+        </w:tc>
+        <w:tc>
+          <w:tcPr>
+            <w:tcW w:w="1800" w:type="dxa"/>
+            <w:vAlign w:val="center"/>
+          </w:tcPr>
+          <w:p>
+            <w:pPr>
+              <w:spacing w:after="30"/>
+            </w:pPr>
+            <w:r>
+              <w:rPr>
+                <w:sz w:val="17"/>
+                <w:szCs w:val="17"/>
+              </w:rPr>
+              <w:t xml:space="preserve">DCE, twin-QoE config</w:t>
+            </w:r>
+          </w:p>
+        </w:tc>
+        <w:tc>
+          <w:tcPr>
+            <w:tcW w:w="1250" w:type="dxa"/>
+            <w:vAlign w:val="center"/>
+          </w:tcPr>
+          <w:p>
+            <w:pPr>
+              <w:spacing w:after="30"/>
+            </w:pPr>
+            <w:r>
+              <w:rPr>
+                <w:sz w:val="17"/>
+                <w:szCs w:val="17"/>
+              </w:rPr>
+              <w:t xml:space="preserve">7/8 (1 HELP)</w:t>
             </w:r>
           </w:p>
         </w:tc>
@@ -1510,64 +1596,46 @@
             </w:pPr>
             <w:r>
               <w:rPr>
-                <w:sz w:val="18"/>
-                <w:szCs w:val="18"/>
-              </w:rPr>
-              <w:t xml:space="preserve">6/6</w:t>
-            </w:r>
-          </w:p>
-        </w:tc>
-        <w:tc>
-          <w:tcPr>
-            <w:tcW w:w="1550" w:type="dxa"/>
-            <w:vAlign w:val="center"/>
-          </w:tcPr>
-          <w:p>
-            <w:pPr>
-              <w:spacing w:after="30"/>
-            </w:pPr>
-            <w:r>
-              <w:rPr>
-                <w:sz w:val="18"/>
-                <w:szCs w:val="18"/>
-              </w:rPr>
-              <w:t xml:space="preserve">88.1 ± 4.9</w:t>
-            </w:r>
-          </w:p>
-        </w:tc>
-        <w:tc>
-          <w:tcPr>
-            <w:tcW w:w="1550" w:type="dxa"/>
-            <w:vAlign w:val="center"/>
-          </w:tcPr>
-          <w:p>
-            <w:pPr>
-              <w:spacing w:after="30"/>
-            </w:pPr>
-            <w:r>
-              <w:rPr>
-                <w:sz w:val="18"/>
-                <w:szCs w:val="18"/>
-              </w:rPr>
-              <w:t xml:space="preserve">0.17 ± 0.33</w:t>
-            </w:r>
-          </w:p>
-        </w:tc>
-        <w:tc>
-          <w:tcPr>
-            <w:tcW w:w="1200" w:type="dxa"/>
-            <w:vAlign w:val="center"/>
-          </w:tcPr>
-          <w:p>
-            <w:pPr>
-              <w:spacing w:after="30"/>
-            </w:pPr>
-            <w:r>
-              <w:rPr>
-                <w:sz w:val="18"/>
-                <w:szCs w:val="18"/>
-              </w:rPr>
-              <w:t xml:space="preserve">10.6 ± 2.9</w:t>
+                <w:sz w:val="17"/>
+                <w:szCs w:val="17"/>
+              </w:rPr>
+              <w:t xml:space="preserve">106.6 ± 5.2</w:t>
+            </w:r>
+          </w:p>
+        </w:tc>
+        <w:tc>
+          <w:tcPr>
+            <w:tcW w:w="1300" w:type="dxa"/>
+            <w:vAlign w:val="center"/>
+          </w:tcPr>
+          <w:p>
+            <w:pPr>
+              <w:spacing w:after="30"/>
+            </w:pPr>
+            <w:r>
+              <w:rPr>
+                <w:sz w:val="17"/>
+                <w:szCs w:val="17"/>
+              </w:rPr>
+              <w:t xml:space="preserve">0.12 ± 0.24</w:t>
+            </w:r>
+          </w:p>
+        </w:tc>
+        <w:tc>
+          <w:tcPr>
+            <w:tcW w:w="1000" w:type="dxa"/>
+            <w:vAlign w:val="center"/>
+          </w:tcPr>
+          <w:p>
+            <w:pPr>
+              <w:spacing w:after="30"/>
+            </w:pPr>
+            <w:r>
+              <w:rPr>
+                <w:sz w:val="17"/>
+                <w:szCs w:val="17"/>
+              </w:rPr>
+              <w:t xml:space="preserve">0.8 ± 0.6</w:t>
             </w:r>
           </w:p>
         </w:tc>
@@ -1575,7 +1643,7 @@
       <w:tr>
         <w:tc>
           <w:tcPr>
-            <w:tcW w:w="3000" w:type="dxa"/>
+            <w:tcW w:w="2050" w:type="dxa"/>
             <w:vAlign w:val="center"/>
           </w:tcPr>
           <w:p>
@@ -1585,10 +1653,46 @@
             <w:r>
               <w:rPr>
                 <w:b/>
-                <w:sz w:val="18"/>
-                <w:szCs w:val="18"/>
-              </w:rPr>
-              <w:t xml:space="preserve">M2, sealed lid (twin-calibrated)</w:t>
+                <w:sz w:val="17"/>
+                <w:szCs w:val="17"/>
+              </w:rPr>
+              <w:t xml:space="preserve">M2 Wrong-DST</w:t>
+            </w:r>
+          </w:p>
+        </w:tc>
+        <w:tc>
+          <w:tcPr>
+            <w:tcW w:w="1800" w:type="dxa"/>
+            <w:vAlign w:val="center"/>
+          </w:tcPr>
+          <w:p>
+            <w:pPr>
+              <w:spacing w:after="30"/>
+            </w:pPr>
+            <w:r>
+              <w:rPr>
+                <w:sz w:val="17"/>
+                <w:szCs w:val="17"/>
+              </w:rPr>
+              <w:t xml:space="preserve">DCE + Layer 2, lab-QoE</w:t>
+            </w:r>
+          </w:p>
+        </w:tc>
+        <w:tc>
+          <w:tcPr>
+            <w:tcW w:w="1250" w:type="dxa"/>
+            <w:vAlign w:val="center"/>
+          </w:tcPr>
+          <w:p>
+            <w:pPr>
+              <w:spacing w:after="30"/>
+            </w:pPr>
+            <w:r>
+              <w:rPr>
+                <w:sz w:val="17"/>
+                <w:szCs w:val="17"/>
+              </w:rPr>
+              <w:t xml:space="preserve">8/8</w:t>
             </w:r>
           </w:p>
         </w:tc>
@@ -1603,8 +1707,434 @@
             </w:pPr>
             <w:r>
               <w:rPr>
-                <w:sz w:val="18"/>
-                <w:szCs w:val="18"/>
+                <w:sz w:val="17"/>
+                <w:szCs w:val="17"/>
+              </w:rPr>
+              <w:t xml:space="preserve">110.6 ± 0.9</w:t>
+            </w:r>
+          </w:p>
+        </w:tc>
+        <w:tc>
+          <w:tcPr>
+            <w:tcW w:w="1300" w:type="dxa"/>
+            <w:vAlign w:val="center"/>
+          </w:tcPr>
+          <w:p>
+            <w:pPr>
+              <w:spacing w:after="30"/>
+            </w:pPr>
+            <w:r>
+              <w:rPr>
+                <w:sz w:val="17"/>
+                <w:szCs w:val="17"/>
+              </w:rPr>
+              <w:t xml:space="preserve">0.00</w:t>
+            </w:r>
+          </w:p>
+        </w:tc>
+        <w:tc>
+          <w:tcPr>
+            <w:tcW w:w="1000" w:type="dxa"/>
+            <w:vAlign w:val="center"/>
+          </w:tcPr>
+          <w:p>
+            <w:pPr>
+              <w:spacing w:after="30"/>
+            </w:pPr>
+            <w:r>
+              <w:rPr>
+                <w:sz w:val="17"/>
+                <w:szCs w:val="17"/>
+              </w:rPr>
+              <w:t xml:space="preserve">0.7 ± 0.3</w:t>
+            </w:r>
+          </w:p>
+        </w:tc>
+      </w:tr>
+      <w:tr>
+        <w:tc>
+          <w:tcPr>
+            <w:tcW w:w="2050" w:type="dxa"/>
+            <w:vAlign w:val="center"/>
+          </w:tcPr>
+          <w:p>
+            <w:pPr>
+              <w:spacing w:after="30"/>
+            </w:pPr>
+            <w:r>
+              <w:rPr>
+                <w:b/>
+                <w:sz w:val="17"/>
+                <w:szCs w:val="17"/>
+              </w:rPr>
+              <w:t xml:space="preserve">M2 Wrong-DST (twin-cal.)</w:t>
+            </w:r>
+          </w:p>
+        </w:tc>
+        <w:tc>
+          <w:tcPr>
+            <w:tcW w:w="1800" w:type="dxa"/>
+            <w:vAlign w:val="center"/>
+          </w:tcPr>
+          <w:p>
+            <w:pPr>
+              <w:spacing w:after="30"/>
+            </w:pPr>
+            <w:r>
+              <w:rPr>
+                <w:sz w:val="17"/>
+                <w:szCs w:val="17"/>
+              </w:rPr>
+              <w:t xml:space="preserve">DCE + Layer 2, twin-QoE</w:t>
+            </w:r>
+          </w:p>
+        </w:tc>
+        <w:tc>
+          <w:tcPr>
+            <w:tcW w:w="1250" w:type="dxa"/>
+            <w:vAlign w:val="center"/>
+          </w:tcPr>
+          <w:p>
+            <w:pPr>
+              <w:spacing w:after="30"/>
+            </w:pPr>
+            <w:r>
+              <w:rPr>
+                <w:sz w:val="17"/>
+                <w:szCs w:val="17"/>
+              </w:rPr>
+              <w:t xml:space="preserve">8/8</w:t>
+            </w:r>
+          </w:p>
+        </w:tc>
+        <w:tc>
+          <w:tcPr>
+            <w:tcW w:w="1300" w:type="dxa"/>
+            <w:vAlign w:val="center"/>
+          </w:tcPr>
+          <w:p>
+            <w:pPr>
+              <w:spacing w:after="30"/>
+            </w:pPr>
+            <w:r>
+              <w:rPr>
+                <w:sz w:val="17"/>
+                <w:szCs w:val="17"/>
+              </w:rPr>
+              <w:t xml:space="preserve">108.4 ± 4.4</w:t>
+            </w:r>
+          </w:p>
+        </w:tc>
+        <w:tc>
+          <w:tcPr>
+            <w:tcW w:w="1300" w:type="dxa"/>
+            <w:vAlign w:val="center"/>
+          </w:tcPr>
+          <w:p>
+            <w:pPr>
+              <w:spacing w:after="30"/>
+            </w:pPr>
+            <w:r>
+              <w:rPr>
+                <w:sz w:val="17"/>
+                <w:szCs w:val="17"/>
+              </w:rPr>
+              <w:t xml:space="preserve">0.00</w:t>
+            </w:r>
+          </w:p>
+        </w:tc>
+        <w:tc>
+          <w:tcPr>
+            <w:tcW w:w="1000" w:type="dxa"/>
+            <w:vAlign w:val="center"/>
+          </w:tcPr>
+          <w:p>
+            <w:pPr>
+              <w:spacing w:after="30"/>
+            </w:pPr>
+            <w:r>
+              <w:rPr>
+                <w:sz w:val="17"/>
+                <w:szCs w:val="17"/>
+              </w:rPr>
+              <w:t xml:space="preserve">0.6 ± 0.2</w:t>
+            </w:r>
+          </w:p>
+        </w:tc>
+      </w:tr>
+      <w:tr>
+        <w:tc>
+          <w:tcPr>
+            <w:tcW w:w="2050" w:type="dxa"/>
+            <w:vAlign w:val="center"/>
+          </w:tcPr>
+          <w:p>
+            <w:pPr>
+              <w:spacing w:after="30"/>
+            </w:pPr>
+            <w:r>
+              <w:rPr>
+                <w:b/>
+                <w:sz w:val="17"/>
+                <w:szCs w:val="17"/>
+              </w:rPr>
+              <w:t xml:space="preserve">M0 sealed lid</w:t>
+            </w:r>
+          </w:p>
+        </w:tc>
+        <w:tc>
+          <w:tcPr>
+            <w:tcW w:w="1800" w:type="dxa"/>
+            <w:vAlign w:val="center"/>
+          </w:tcPr>
+          <w:p>
+            <w:pPr>
+              <w:spacing w:after="30"/>
+            </w:pPr>
+            <w:r>
+              <w:rPr>
+                <w:sz w:val="17"/>
+                <w:szCs w:val="17"/>
+              </w:rPr>
+              <w:t xml:space="preserve">none</w:t>
+            </w:r>
+          </w:p>
+        </w:tc>
+        <w:tc>
+          <w:tcPr>
+            <w:tcW w:w="1250" w:type="dxa"/>
+            <w:vAlign w:val="center"/>
+          </w:tcPr>
+          <w:p>
+            <w:pPr>
+              <w:spacing w:after="30"/>
+            </w:pPr>
+            <w:r>
+              <w:rPr>
+                <w:sz w:val="17"/>
+                <w:szCs w:val="17"/>
+              </w:rPr>
+              <w:t xml:space="preserve">6/6</w:t>
+            </w:r>
+          </w:p>
+        </w:tc>
+        <w:tc>
+          <w:tcPr>
+            <w:tcW w:w="1300" w:type="dxa"/>
+            <w:vAlign w:val="center"/>
+          </w:tcPr>
+          <w:p>
+            <w:pPr>
+              <w:spacing w:after="30"/>
+            </w:pPr>
+            <w:r>
+              <w:rPr>
+                <w:sz w:val="17"/>
+                <w:szCs w:val="17"/>
+              </w:rPr>
+              <w:t xml:space="preserve">88.1 ± 4.9</w:t>
+            </w:r>
+          </w:p>
+        </w:tc>
+        <w:tc>
+          <w:tcPr>
+            <w:tcW w:w="1300" w:type="dxa"/>
+            <w:vAlign w:val="center"/>
+          </w:tcPr>
+          <w:p>
+            <w:pPr>
+              <w:spacing w:after="30"/>
+            </w:pPr>
+            <w:r>
+              <w:rPr>
+                <w:sz w:val="17"/>
+                <w:szCs w:val="17"/>
+              </w:rPr>
+              <w:t xml:space="preserve">0.17 ± 0.33</w:t>
+            </w:r>
+          </w:p>
+        </w:tc>
+        <w:tc>
+          <w:tcPr>
+            <w:tcW w:w="1000" w:type="dxa"/>
+            <w:vAlign w:val="center"/>
+          </w:tcPr>
+          <w:p>
+            <w:pPr>
+              <w:spacing w:after="30"/>
+            </w:pPr>
+            <w:r>
+              <w:rPr>
+                <w:sz w:val="17"/>
+                <w:szCs w:val="17"/>
+              </w:rPr>
+              <w:t xml:space="preserve">10.6 ± 2.9</w:t>
+            </w:r>
+          </w:p>
+        </w:tc>
+      </w:tr>
+      <w:tr>
+        <w:tc>
+          <w:tcPr>
+            <w:tcW w:w="2050" w:type="dxa"/>
+            <w:vAlign w:val="center"/>
+          </w:tcPr>
+          <w:p>
+            <w:pPr>
+              <w:spacing w:after="30"/>
+            </w:pPr>
+            <w:r>
+              <w:rPr>
+                <w:b/>
+                <w:sz w:val="17"/>
+                <w:szCs w:val="17"/>
+              </w:rPr>
+              <w:t xml:space="preserve">M2 sealed lid</w:t>
+            </w:r>
+          </w:p>
+        </w:tc>
+        <w:tc>
+          <w:tcPr>
+            <w:tcW w:w="1800" w:type="dxa"/>
+            <w:vAlign w:val="center"/>
+          </w:tcPr>
+          <w:p>
+            <w:pPr>
+              <w:spacing w:after="30"/>
+            </w:pPr>
+            <w:r>
+              <w:rPr>
+                <w:sz w:val="17"/>
+                <w:szCs w:val="17"/>
+              </w:rPr>
+              <w:t xml:space="preserve">DCE, lab-QoE config</w:t>
+            </w:r>
+          </w:p>
+        </w:tc>
+        <w:tc>
+          <w:tcPr>
+            <w:tcW w:w="1250" w:type="dxa"/>
+            <w:vAlign w:val="center"/>
+          </w:tcPr>
+          <w:p>
+            <w:pPr>
+              <w:spacing w:after="30"/>
+            </w:pPr>
+            <w:r>
+              <w:rPr>
+                <w:sz w:val="17"/>
+                <w:szCs w:val="17"/>
+              </w:rPr>
+              <w:t xml:space="preserve">4/6 (2 HELP)</w:t>
+            </w:r>
+          </w:p>
+        </w:tc>
+        <w:tc>
+          <w:tcPr>
+            <w:tcW w:w="1300" w:type="dxa"/>
+            <w:vAlign w:val="center"/>
+          </w:tcPr>
+          <w:p>
+            <w:pPr>
+              <w:spacing w:after="30"/>
+            </w:pPr>
+            <w:r>
+              <w:rPr>
+                <w:sz w:val="17"/>
+                <w:szCs w:val="17"/>
+              </w:rPr>
+              <w:t xml:space="preserve">111.5 ± 7.3</w:t>
+            </w:r>
+          </w:p>
+        </w:tc>
+        <w:tc>
+          <w:tcPr>
+            <w:tcW w:w="1300" w:type="dxa"/>
+            <w:vAlign w:val="center"/>
+          </w:tcPr>
+          <w:p>
+            <w:pPr>
+              <w:spacing w:after="30"/>
+            </w:pPr>
+            <w:r>
+              <w:rPr>
+                <w:sz w:val="17"/>
+                <w:szCs w:val="17"/>
+              </w:rPr>
+              <w:t xml:space="preserve">0.00</w:t>
+            </w:r>
+          </w:p>
+        </w:tc>
+        <w:tc>
+          <w:tcPr>
+            <w:tcW w:w="1000" w:type="dxa"/>
+            <w:vAlign w:val="center"/>
+          </w:tcPr>
+          <w:p>
+            <w:pPr>
+              <w:spacing w:after="30"/>
+            </w:pPr>
+            <w:r>
+              <w:rPr>
+                <w:sz w:val="17"/>
+                <w:szCs w:val="17"/>
+              </w:rPr>
+              <w:t xml:space="preserve">1.0 ± 0.4</w:t>
+            </w:r>
+          </w:p>
+        </w:tc>
+      </w:tr>
+      <w:tr>
+        <w:tc>
+          <w:tcPr>
+            <w:tcW w:w="2050" w:type="dxa"/>
+            <w:vAlign w:val="center"/>
+          </w:tcPr>
+          <w:p>
+            <w:pPr>
+              <w:spacing w:after="30"/>
+            </w:pPr>
+            <w:r>
+              <w:rPr>
+                <w:b/>
+                <w:sz w:val="17"/>
+                <w:szCs w:val="17"/>
+              </w:rPr>
+              <w:t xml:space="preserve">M2 sealed lid (twin-cal.)</w:t>
+            </w:r>
+          </w:p>
+        </w:tc>
+        <w:tc>
+          <w:tcPr>
+            <w:tcW w:w="1800" w:type="dxa"/>
+            <w:vAlign w:val="center"/>
+          </w:tcPr>
+          <w:p>
+            <w:pPr>
+              <w:spacing w:after="30"/>
+            </w:pPr>
+            <w:r>
+              <w:rPr>
+                <w:sz w:val="17"/>
+                <w:szCs w:val="17"/>
+              </w:rPr>
+              <w:t xml:space="preserve">DCE, twin-QoE config</w:t>
+            </w:r>
+          </w:p>
+        </w:tc>
+        <w:tc>
+          <w:tcPr>
+            <w:tcW w:w="1250" w:type="dxa"/>
+            <w:vAlign w:val="center"/>
+          </w:tcPr>
+          <w:p>
+            <w:pPr>
+              <w:spacing w:after="30"/>
+            </w:pPr>
+            <w:r>
+              <w:rPr>
+                <w:sz w:val="17"/>
+                <w:szCs w:val="17"/>
               </w:rPr>
               <w:t xml:space="preserve">5/6 (1 HELP)</w:t>
             </w:r>
@@ -1612,17 +2142,17 @@
         </w:tc>
         <w:tc>
           <w:tcPr>
-            <w:tcW w:w="1550" w:type="dxa"/>
-            <w:vAlign w:val="center"/>
-          </w:tcPr>
-          <w:p>
-            <w:pPr>
-              <w:spacing w:after="30"/>
-            </w:pPr>
-            <w:r>
-              <w:rPr>
-                <w:sz w:val="18"/>
-                <w:szCs w:val="18"/>
+            <w:tcW w:w="1300" w:type="dxa"/>
+            <w:vAlign w:val="center"/>
+          </w:tcPr>
+          <w:p>
+            <w:pPr>
+              <w:spacing w:after="30"/>
+            </w:pPr>
+            <w:r>
+              <w:rPr>
+                <w:sz w:val="17"/>
+                <w:szCs w:val="17"/>
               </w:rPr>
               <w:t xml:space="preserve">102.5 ± 2.2</w:t>
             </w:r>
@@ -1630,17 +2160,17 @@
         </w:tc>
         <w:tc>
           <w:tcPr>
-            <w:tcW w:w="1550" w:type="dxa"/>
-            <w:vAlign w:val="center"/>
-          </w:tcPr>
-          <w:p>
-            <w:pPr>
-              <w:spacing w:after="30"/>
-            </w:pPr>
-            <w:r>
-              <w:rPr>
-                <w:sz w:val="18"/>
-                <w:szCs w:val="18"/>
+            <w:tcW w:w="1300" w:type="dxa"/>
+            <w:vAlign w:val="center"/>
+          </w:tcPr>
+          <w:p>
+            <w:pPr>
+              <w:spacing w:after="30"/>
+            </w:pPr>
+            <w:r>
+              <w:rPr>
+                <w:sz w:val="17"/>
+                <w:szCs w:val="17"/>
               </w:rPr>
               <w:t xml:space="preserve">0.17 ± 0.33</w:t>
             </w:r>
@@ -1648,17 +2178,17 @@
         </w:tc>
         <w:tc>
           <w:tcPr>
-            <w:tcW w:w="1200" w:type="dxa"/>
-            <w:vAlign w:val="center"/>
-          </w:tcPr>
-          <w:p>
-            <w:pPr>
-              <w:spacing w:after="30"/>
-            </w:pPr>
-            <w:r>
-              <w:rPr>
-                <w:sz w:val="18"/>
-                <w:szCs w:val="18"/>
+            <w:tcW w:w="1000" w:type="dxa"/>
+            <w:vAlign w:val="center"/>
+          </w:tcPr>
+          <w:p>
+            <w:pPr>
+              <w:spacing w:after="30"/>
+            </w:pPr>
+            <w:r>
+              <w:rPr>
+                <w:sz w:val="17"/>
+                <w:szCs w:val="17"/>
               </w:rPr>
               <w:t xml:space="preserve">0.7 ± 0.5</w:t>
             </w:r>
@@ -1666,6 +2196,355 @@
         </w:tc>
       </w:tr>
     </w:tbl>
+    <w:p>
+      <w:pPr>
+        <w:spacing w:after="200" w:line="276" w:lineRule="auto"/>
+      </w:pPr>
+      <w:r>
+        <w:rPr>
+          <w:i/>
+          <w:color w:val="595959"/>
+          <w:sz w:val="18"/>
+          <w:szCs w:val="18"/>
+        </w:rPr>
+        <w:t xml:space="preserve">Table 1. Full campaign results (82 valid runs). Lab-QoE = QoE boundaries calibrated on the physical laboratory; twin-QoE = re-calibrated from measured twin distributions.</w:t>
+      </w:r>
+    </w:p>
+    <w:p>
+      <w:pPr>
+        <w:jc w:val="center"/>
+        <w:spacing w:after="60"/>
+      </w:pPr>
+      <w:r>
+        <w:drawing>
+          <wp:inline xmlns:wp="http://schemas.openxmlformats.org/drawingml/2006/wordprocessingDrawing" distT="0" distB="0" distL="0" distR="0">
+            <wp:extent cx="5294376" cy="3547872"/>
+            <wp:docPr id="1" name="Fig1"/>
+            <a:graphic xmlns:a="http://schemas.openxmlformats.org/drawingml/2006/main">
+              <a:graphicData uri="http://schemas.openxmlformats.org/drawingml/2006/picture">
+                <pic:pic xmlns:pic="http://schemas.openxmlformats.org/drawingml/2006/picture">
+                  <pic:nvPicPr>
+                    <pic:cNvPr id="1" name="Fig1"/>
+                    <pic:cNvPicPr/>
+                  </pic:nvPicPr>
+                  <pic:blipFill>
+                    <a:blip xmlns:r="http://schemas.openxmlformats.org/officeDocument/2006/relationships" r:embed="rIdImg1"/>
+                    <a:stretch>
+                      <a:fillRect/>
+                    </a:stretch>
+                  </pic:blipFill>
+                  <pic:spPr>
+                    <a:xfrm>
+                      <a:off x="0" y="0"/>
+                      <a:ext cx="5294376" cy="3547872"/>
+                    </a:xfrm>
+                    <a:prstGeom prst="rect">
+                      <a:avLst/>
+                    </a:prstGeom>
+                  </pic:spPr>
+                </pic:pic>
+              </a:graphicData>
+            </a:graphic>
+          </wp:inline>
+        </w:drawing>
+      </w:r>
+    </w:p>
+    <w:p>
+      <w:pPr>
+        <w:spacing w:after="220" w:line="276" w:lineRule="auto"/>
+        <w:jc w:val="center"/>
+      </w:pPr>
+      <w:r>
+        <w:rPr>
+          <w:i/>
+          <w:color w:val="595959"/>
+          <w:sz w:val="18"/>
+          <w:szCs w:val="18"/>
+        </w:rPr>
+        <w:t xml:space="preserve">Figure 1. Safety-time trade-off. The ungoverned baseline is fast but spills on half of its runs; every governed arm collapses into a zero/near-zero-spill cluster at a 25-35% time cost. The tightness of the cluster is itself the finding: governance outcome is robust to which prior is loaded.</w:t>
+      </w:r>
+    </w:p>
+    <w:p>
+      <w:pPr>
+        <w:jc w:val="center"/>
+        <w:spacing w:after="60"/>
+      </w:pPr>
+      <w:r>
+        <w:drawing>
+          <wp:inline xmlns:wp="http://schemas.openxmlformats.org/drawingml/2006/wordprocessingDrawing" distT="0" distB="0" distL="0" distR="0">
+            <wp:extent cx="4974336" cy="3721608"/>
+            <wp:docPr id="2" name="Fig2"/>
+            <a:graphic xmlns:a="http://schemas.openxmlformats.org/drawingml/2006/main">
+              <a:graphicData uri="http://schemas.openxmlformats.org/drawingml/2006/picture">
+                <pic:pic xmlns:pic="http://schemas.openxmlformats.org/drawingml/2006/picture">
+                  <pic:nvPicPr>
+                    <pic:cNvPr id="2" name="Fig2"/>
+                    <pic:cNvPicPr/>
+                  </pic:nvPicPr>
+                  <pic:blipFill>
+                    <a:blip xmlns:r="http://schemas.openxmlformats.org/officeDocument/2006/relationships" r:embed="rIdImg2"/>
+                    <a:stretch>
+                      <a:fillRect/>
+                    </a:stretch>
+                  </pic:blipFill>
+                  <pic:spPr>
+                    <a:xfrm>
+                      <a:off x="0" y="0"/>
+                      <a:ext cx="4974336" cy="3721608"/>
+                    </a:xfrm>
+                    <a:prstGeom prst="rect">
+                      <a:avLst/>
+                    </a:prstGeom>
+                  </pic:spPr>
+                </pic:pic>
+              </a:graphicData>
+            </a:graphic>
+          </wp:inline>
+        </w:drawing>
+      </w:r>
+    </w:p>
+    <w:p>
+      <w:pPr>
+        <w:spacing w:after="220" w:line="276" w:lineRule="auto"/>
+        <w:jc w:val="center"/>
+      </w:pPr>
+      <w:r>
+        <w:rPr>
+          <w:i/>
+          <w:color w:val="595959"/>
+          <w:sz w:val="18"/>
+          <w:szCs w:val="18"/>
+        </w:rPr>
+        <w:t xml:space="preserve">Figure 2. Continuous risk exposure by arm. The ungoverned arms (open and sealed lid) spend an order of magnitude more time near the spill threshold than any governed arm; the sealed lid reduces realised spills but not the exposure, confirming its gain is passive physics.</w:t>
+      </w:r>
+    </w:p>
+    <w:p>
+      <w:pPr>
+        <w:spacing w:after="160" w:line="276" w:lineRule="auto"/>
+      </w:pPr>
+      <w:r>
+        <w:rPr>
+          <w:b/>
+        </w:rPr>
+        <w:t xml:space="preserve">Finding 1 — deployability governance converts spills into bounded time cost</w:t>
+      </w:r>
+      <w:r>
+        <w:t xml:space="preserve"> (Fig. 1): M0 spills 0.50/run at 8.1% exposure; M2 payload governance eliminates spills (0/8; 0.4%) at +29% time with 8/8 completion. </w:t>
+      </w:r>
+      <w:r>
+        <w:rPr>
+          <w:b/>
+        </w:rPr>
+        <w:t xml:space="preserve">Finding 2 — HELP semantics</w:t>
+      </w:r>
+      <w:r>
+        <w:t xml:space="preserve">: with a single-analogy candidate set, a mobility hard veto while pressing the corridor pinch empties the deployable set; sustained HELP aborts the run (3/8). This is the specified conservative non-selection behaviour, not a failure.</w:t>
+      </w:r>
+    </w:p>
+    <w:p>
+      <w:pPr>
+        <w:jc w:val="center"/>
+        <w:spacing w:after="60"/>
+      </w:pPr>
+      <w:r>
+        <w:drawing>
+          <wp:inline xmlns:wp="http://schemas.openxmlformats.org/drawingml/2006/wordprocessingDrawing" distT="0" distB="0" distL="0" distR="0">
+            <wp:extent cx="4974336" cy="3113532"/>
+            <wp:docPr id="3" name="Fig3"/>
+            <a:graphic xmlns:a="http://schemas.openxmlformats.org/drawingml/2006/main">
+              <a:graphicData uri="http://schemas.openxmlformats.org/drawingml/2006/picture">
+                <pic:pic xmlns:pic="http://schemas.openxmlformats.org/drawingml/2006/picture">
+                  <pic:nvPicPr>
+                    <pic:cNvPr id="3" name="Fig3"/>
+                    <pic:cNvPicPr/>
+                  </pic:nvPicPr>
+                  <pic:blipFill>
+                    <a:blip xmlns:r="http://schemas.openxmlformats.org/officeDocument/2006/relationships" r:embed="rIdImg3"/>
+                    <a:stretch>
+                      <a:fillRect/>
+                    </a:stretch>
+                  </pic:blipFill>
+                  <pic:spPr>
+                    <a:xfrm>
+                      <a:off x="0" y="0"/>
+                      <a:ext cx="4974336" cy="3113532"/>
+                    </a:xfrm>
+                    <a:prstGeom prst="rect">
+                      <a:avLst/>
+                    </a:prstGeom>
+                  </pic:spPr>
+                </pic:pic>
+              </a:graphicData>
+            </a:graphic>
+          </wp:inline>
+        </w:drawing>
+      </w:r>
+    </w:p>
+    <w:p>
+      <w:pPr>
+        <w:spacing w:after="220" w:line="276" w:lineRule="auto"/>
+        <w:jc w:val="center"/>
+      </w:pPr>
+      <w:r>
+        <w:rPr>
+          <w:i/>
+          <w:color w:val="595959"/>
+          <w:sz w:val="18"/>
+          <w:szCs w:val="18"/>
+        </w:rPr>
+        <w:t xml:space="preserve">Figure 3. The calibration-limited regime, observed live. The physical-lab QoE boundary for the efficient capability (0.75) sits above the twin’s cruise clearance distribution: the capability is never certifiable on the twin until the boundary is re-calibrated from measured distributions (0.60), per the interface-refinement pattern.</w:t>
+      </w:r>
+    </w:p>
+    <w:p>
+      <w:pPr>
+        <w:spacing w:after="160" w:line="276" w:lineRule="auto"/>
+      </w:pPr>
+      <w:r>
+        <w:rPr>
+          <w:b/>
+        </w:rPr>
+        <w:t xml:space="preserve">Finding 3 — θ_QoE in deployment</w:t>
+      </w:r>
+      <w:r>
+        <w:t xml:space="preserve"> (Fig. 3): the twin's clearance distribution is systematically narrower than the physical laboratory's; running the lab calibration unchanged leaves Efficient_Nav non-certifiable for entire runs. Re-calibration restored certification in open stretches without touching the reasoner or the physical-robot configuration.</w:t>
+      </w:r>
+    </w:p>
+    <w:p>
+      <w:pPr>
+        <w:jc w:val="center"/>
+        <w:spacing w:after="60"/>
+      </w:pPr>
+      <w:r>
+        <w:drawing>
+          <wp:inline xmlns:wp="http://schemas.openxmlformats.org/drawingml/2006/wordprocessingDrawing" distT="0" distB="0" distL="0" distR="0">
+            <wp:extent cx="5047488" cy="2756916"/>
+            <wp:docPr id="4" name="Fig4"/>
+            <a:graphic xmlns:a="http://schemas.openxmlformats.org/drawingml/2006/main">
+              <a:graphicData uri="http://schemas.openxmlformats.org/drawingml/2006/picture">
+                <pic:pic xmlns:pic="http://schemas.openxmlformats.org/drawingml/2006/picture">
+                  <pic:nvPicPr>
+                    <pic:cNvPr id="4" name="Fig4"/>
+                    <pic:cNvPicPr/>
+                  </pic:nvPicPr>
+                  <pic:blipFill>
+                    <a:blip xmlns:r="http://schemas.openxmlformats.org/officeDocument/2006/relationships" r:embed="rIdImg4"/>
+                    <a:stretch>
+                      <a:fillRect/>
+                    </a:stretch>
+                  </pic:blipFill>
+                  <pic:spPr>
+                    <a:xfrm>
+                      <a:off x="0" y="0"/>
+                      <a:ext cx="5047488" cy="2756916"/>
+                    </a:xfrm>
+                    <a:prstGeom prst="rect">
+                      <a:avLst/>
+                    </a:prstGeom>
+                  </pic:spPr>
+                </pic:pic>
+              </a:graphicData>
+            </a:graphic>
+          </wp:inline>
+        </w:drawing>
+      </w:r>
+    </w:p>
+    <w:p>
+      <w:pPr>
+        <w:spacing w:after="220" w:line="276" w:lineRule="auto"/>
+        <w:jc w:val="center"/>
+      </w:pPr>
+      <w:r>
+        <w:rPr>
+          <w:i/>
+          <w:color w:val="595959"/>
+          <w:sz w:val="18"/>
+          <w:szCs w:val="18"/>
+        </w:rPr>
+        <w:t xml:space="preserve">Figure 4. Lid-state deltas. The ungoverned baseline improves only through physics (fewer realised spills, identical exposure); the twin-calibrated governed system also converts the sealed lid into speed (102.5 ± 2.2 s vs 111.5 ± 7.3 s), a policy-level exploitation unavailable to fixed baselines.</w:t>
+      </w:r>
+    </w:p>
+    <w:p>
+      <w:pPr>
+        <w:jc w:val="center"/>
+        <w:spacing w:after="60"/>
+      </w:pPr>
+      <w:r>
+        <w:drawing>
+          <wp:inline xmlns:wp="http://schemas.openxmlformats.org/drawingml/2006/wordprocessingDrawing" distT="0" distB="0" distL="0" distR="0">
+            <wp:extent cx="5632704" cy="3113532"/>
+            <wp:docPr id="5" name="Fig5"/>
+            <a:graphic xmlns:a="http://schemas.openxmlformats.org/drawingml/2006/main">
+              <a:graphicData uri="http://schemas.openxmlformats.org/drawingml/2006/picture">
+                <pic:pic xmlns:pic="http://schemas.openxmlformats.org/drawingml/2006/picture">
+                  <pic:nvPicPr>
+                    <pic:cNvPr id="5" name="Fig5"/>
+                    <pic:cNvPicPr/>
+                  </pic:nvPicPr>
+                  <pic:blipFill>
+                    <a:blip xmlns:r="http://schemas.openxmlformats.org/officeDocument/2006/relationships" r:embed="rIdImg5"/>
+                    <a:stretch>
+                      <a:fillRect/>
+                    </a:stretch>
+                  </pic:blipFill>
+                  <pic:spPr>
+                    <a:xfrm>
+                      <a:off x="0" y="0"/>
+                      <a:ext cx="5632704" cy="3113532"/>
+                    </a:xfrm>
+                    <a:prstGeom prst="rect">
+                      <a:avLst/>
+                    </a:prstGeom>
+                  </pic:spPr>
+                </pic:pic>
+              </a:graphicData>
+            </a:graphic>
+          </wp:inline>
+        </w:drawing>
+      </w:r>
+    </w:p>
+    <w:p>
+      <w:pPr>
+        <w:spacing w:after="220" w:line="276" w:lineRule="auto"/>
+        <w:jc w:val="center"/>
+      </w:pPr>
+      <w:r>
+        <w:rPr>
+          <w:i/>
+          <w:color w:val="595959"/>
+          <w:sz w:val="18"/>
+          <w:szCs w:val="18"/>
+        </w:rPr>
+        <w:t xml:space="preserve">Figure 5. Cross-run analogical trust (Layer 2), mechanistic validation. Under a forced wrong prior with spills attributed to it, plausibility degrades 1.00 → 0.75 → 0.53 → 0.36 by Dempster fusion; crossing the blend threshold (0.70) progressively caps the analogy’s speed, and crossing the deployment veto (0.45) makes run 4 start pre-corrected in the conservative analogy.</w:t>
+      </w:r>
+    </w:p>
+    <w:p>
+      <w:pPr>
+        <w:spacing w:after="160" w:line="276" w:lineRule="auto"/>
+      </w:pPr>
+      <w:r>
+        <w:rPr>
+          <w:b/>
+        </w:rPr>
+        <w:t xml:space="preserve">Finding 5 — temporal scales separate as designed</w:t>
+      </w:r>
+      <w:r>
+        <w:t xml:space="preserve"> (Fig. 5): in the twin campaign the Wrong-DST arms show flat, spill-free sequences because per-tick shared-experience evidence corrects the task-blind prior within ≈ 4 s of each run — before any spill can occur — so the run-level trust layer receives no failure signal. The mechanism itself is validated in the controlled trace of Fig. 5. Its operational regime is the physical laboratory, where open-floor cruising genuinely certifies the fast capability and gait-induced spills are invisible to per-tick channels; the twenty-run physical campaign exercises it.</w:t>
+      </w:r>
+    </w:p>
+    <w:p>
+      <w:pPr>
+        <w:spacing w:after="160" w:line="276" w:lineRule="auto"/>
+      </w:pPr>
+      <w:r>
+        <w:rPr>
+          <w:b/>
+        </w:rPr>
+        <w:t xml:space="preserve">Fidelity to theory.</w:t>
+      </w:r>
+      <w:r>
+        <w:t xml:space="preserve"> Four of the five claims instantiated by the campaign are confirmed with statistics (Findings 1-4); the fifth is confirmed mechanistically with its operational regime correctly predicted to lie on the physical robot. Two artefacts were caught and corrected by consistency checking before affecting conclusions: a run with governance silently disabled (excluded) and a single-candidate arm originally mislabelled as the M1 baseline (retained as the HELP-semantics arm; a true fixed-cap M1 was added).</w:t>
+      </w:r>
+    </w:p>
     <w:p>
       <w:pPr>
         <w:spacing w:after="200" w:line="276" w:lineRule="auto"/>
@@ -1677,7 +2556,7 @@
           <w:sz w:val="20"/>
           <w:szCs w:val="20"/>
         </w:rPr>
-        <w:t xml:space="preserve">The five findings and the physical-robot protocol are stated in Section VII.H of the manuscript; this document supplies the methodological detail behind them.</w:t>
+        <w:t xml:space="preserve">Datasets, configurations, the aggregation script and figure-generation code are versioned with the robot stack (commits up to the 2026-07-04 campaign).</w:t>
       </w:r>
     </w:p>
     <w:sectPr>

</xml_diff>

<commit_message>
docs rev.2: mapeo explicito de las 4 capas (tesis Cap.5 <-> G1) + seccion rho_DCA; HANDOFF 8.18
Co-Authored-By: Claude Fable 5 <noreply@anthropic.com>
</commit_message>
<xml_diff>
--- a/docs/G1_Empirical_Validation_VIIH_draft.docx
+++ b/docs/G1_Empirical_Validation_VIIH_draft.docx
@@ -41,7 +41,7 @@
           <w:sz w:val="20"/>
           <w:szCs w:val="20"/>
         </w:rPr>
-        <w:t xml:space="preserve">Simulation campaign 2026-07-04 · Unitree G1 · Gazebo (ROS 2 Humble) · 99 simulation runs, 82 valid formal-campaign runs across 11 arms</w:t>
+        <w:t xml:space="preserve">Simulation campaign 2026-07-04 · Unitree G1 · Gazebo (ROS 2 Humble) · 99 simulation runs, 82 valid formal-campaign runs across 11 arms · rev. 2 (four-layer architecture + runtime certification ratio)</w:t>
       </w:r>
     </w:p>
     <w:p>
@@ -726,10 +726,10 @@
     </w:tbl>
     <w:p>
       <w:pPr>
-        <w:spacing w:after="120" w:line="276" w:lineRule="auto"/>
-      </w:pPr>
-      <w:r>
-        <w:t xml:space="preserve">Readings are median-smoothed (~2.5 s) and each reading's DST uncertainty adds the historical dispersion of its own metric (few-shot margin). Switches are hysteretic; an experience-escalation layer aborts on sustained HELP (≥ 8 s, scaled ×2 for the twin's ≈ 0.5 real-time factor) or a stagnant high-FALLBACK window.</w:t>
+        <w:spacing w:after="140" w:line="276" w:lineRule="auto"/>
+      </w:pPr>
+      <w:r>
+        <w:t xml:space="preserve">Readings are median-smoothed (~2.5 s) and each reading's DST uncertainty adds the historical dispersion of its own metric (few-shot margin). Switches are hysteretic; an experience-escalation layer aborts on sustained HELP or a stagnant high-FALLBACK window.</w:t>
       </w:r>
     </w:p>
     <w:p>
@@ -743,7 +743,7 @@
           <w:sz w:val="26"/>
           <w:szCs w:val="26"/>
         </w:rPr>
-        <w:t xml:space="preserve">3.1  Two-layer trust (thesis Ch. 5 realised on the G1)</w:t>
+        <w:t xml:space="preserve">3.1  Realising the four-layer belief architecture of thesis Chapter 5</w:t>
       </w:r>
     </w:p>
     <w:p>
@@ -751,13 +751,462 @@
         <w:spacing w:after="160" w:line="276" w:lineRule="auto"/>
       </w:pPr>
       <w:r>
+        <w:t xml:space="preserve">Chapter 5 of the thesis specifies three DST belief layers plus a deployment-level Meta-Attention layer, each addressing a distinct failure mode at its own timescale. Table 2 maps each layer to its realisation on the G1. Layers 1-2 run in every governed experiment; Layers 3-4 are implemented and validated but opt-in (they were disabled during the reported campaign so that the published arms remain exactly reproducible).</w:t>
+      </w:r>
+    </w:p>
+    <w:tbl>
+      <w:tblPr>
+        <w:tblW w:w="9250" w:type="dxa"/>
+        <w:tblBorders>
+          <w:top w:val="single" w:sz="4" w:color="8EAADB"/>
+          <w:left w:val="single" w:sz="4" w:color="8EAADB"/>
+          <w:bottom w:val="single" w:sz="4" w:color="8EAADB"/>
+          <w:right w:val="single" w:sz="4" w:color="8EAADB"/>
+          <w:insideH w:val="single" w:sz="4" w:color="8EAADB"/>
+          <w:insideV w:val="single" w:sz="4" w:color="8EAADB"/>
+        </w:tblBorders>
+      </w:tblPr>
+      <w:tblGrid>
+        <w:gridCol w:w="2500"/>
+        <w:gridCol w:w="950"/>
+        <w:gridCol w:w="4600"/>
+        <w:gridCol w:w="1200"/>
+      </w:tblGrid>
+      <w:tr>
+        <w:tc>
+          <w:tcPr>
+            <w:tcW w:w="2500" w:type="dxa"/>
+            <w:shd w:val="clear" w:color="auto" w:fill="1F3864"/>
+            <w:vAlign w:val="center"/>
+          </w:tcPr>
+          <w:p>
+            <w:pPr>
+              <w:spacing w:after="30"/>
+            </w:pPr>
+            <w:r>
+              <w:rPr>
+                <w:b/>
+                <w:color w:val="FFFFFF"/>
+                <w:sz w:val="15"/>
+                <w:szCs w:val="15"/>
+              </w:rPr>
+              <w:t xml:space="preserve">Thesis layer</w:t>
+            </w:r>
+          </w:p>
+        </w:tc>
+        <w:tc>
+          <w:tcPr>
+            <w:tcW w:w="950" w:type="dxa"/>
+            <w:shd w:val="clear" w:color="auto" w:fill="1F3864"/>
+            <w:vAlign w:val="center"/>
+          </w:tcPr>
+          <w:p>
+            <w:pPr>
+              <w:spacing w:after="30"/>
+            </w:pPr>
+            <w:r>
+              <w:rPr>
+                <w:b/>
+                <w:color w:val="FFFFFF"/>
+                <w:sz w:val="15"/>
+                <w:szCs w:val="15"/>
+              </w:rPr>
+              <w:t xml:space="preserve">Timescale</w:t>
+            </w:r>
+          </w:p>
+        </w:tc>
+        <w:tc>
+          <w:tcPr>
+            <w:tcW w:w="4600" w:type="dxa"/>
+            <w:shd w:val="clear" w:color="auto" w:fill="1F3864"/>
+            <w:vAlign w:val="center"/>
+          </w:tcPr>
+          <w:p>
+            <w:pPr>
+              <w:spacing w:after="30"/>
+            </w:pPr>
+            <w:r>
+              <w:rPr>
+                <w:b/>
+                <w:color w:val="FFFFFF"/>
+                <w:sz w:val="15"/>
+                <w:szCs w:val="15"/>
+              </w:rPr>
+              <w:t xml:space="preserve">G1 realisation</w:t>
+            </w:r>
+          </w:p>
+        </w:tc>
+        <w:tc>
+          <w:tcPr>
+            <w:tcW w:w="1200" w:type="dxa"/>
+            <w:shd w:val="clear" w:color="auto" w:fill="1F3864"/>
+            <w:vAlign w:val="center"/>
+          </w:tcPr>
+          <w:p>
+            <w:pPr>
+              <w:spacing w:after="30"/>
+            </w:pPr>
+            <w:r>
+              <w:rPr>
+                <w:b/>
+                <w:color w:val="FFFFFF"/>
+                <w:sz w:val="15"/>
+                <w:szCs w:val="15"/>
+              </w:rPr>
+              <w:t xml:space="preserve">Status</w:t>
+            </w:r>
+          </w:p>
+        </w:tc>
+      </w:tr>
+      <w:tr>
+        <w:tc>
+          <w:tcPr>
+            <w:tcW w:w="2500" w:type="dxa"/>
+            <w:vAlign w:val="center"/>
+          </w:tcPr>
+          <w:p>
+            <w:pPr>
+              <w:spacing w:after="30"/>
+            </w:pPr>
+            <w:r>
+              <w:rPr>
+                <w:sz w:val="15"/>
+                <w:szCs w:val="15"/>
+              </w:rPr>
+              <w:t xml:space="preserve">L1 — path-hazard plausibility (Pl_H): collapse transfer, force conservative</w:t>
+            </w:r>
+          </w:p>
+        </w:tc>
+        <w:tc>
+          <w:tcPr>
+            <w:tcW w:w="950" w:type="dxa"/>
+            <w:vAlign w:val="center"/>
+          </w:tcPr>
+          <w:p>
+            <w:pPr>
+              <w:spacing w:after="30"/>
+            </w:pPr>
+            <w:r>
+              <w:rPr>
+                <w:sz w:val="15"/>
+                <w:szCs w:val="15"/>
+              </w:rPr>
+              <w:t xml:space="preserve">sensor frame</w:t>
+            </w:r>
+          </w:p>
+        </w:tc>
+        <w:tc>
+          <w:tcPr>
+            <w:tcW w:w="4600" w:type="dxa"/>
+            <w:vAlign w:val="center"/>
+          </w:tcPr>
+          <w:p>
+            <w:pPr>
+              <w:spacing w:after="30"/>
+            </w:pPr>
+            <w:r>
+              <w:rPr>
+                <w:sz w:val="15"/>
+                <w:szCs w:val="15"/>
+              </w:rPr>
+              <w:t xml:space="preserve">Per-tick analogy-level DST on the safety reading with QoE regions and hard veto inside the reasoner (strips certification in ~2 ticks; measured ≈4 s correction of a task-blind prior), over the stack's own hard safety guards</w:t>
+            </w:r>
+          </w:p>
+        </w:tc>
+        <w:tc>
+          <w:tcPr>
+            <w:tcW w:w="1200" w:type="dxa"/>
+            <w:vAlign w:val="center"/>
+          </w:tcPr>
+          <w:p>
+            <w:pPr>
+              <w:spacing w:after="30"/>
+            </w:pPr>
+            <w:r>
+              <w:rPr>
+                <w:sz w:val="15"/>
+                <w:szCs w:val="15"/>
+              </w:rPr>
+              <w:t xml:space="preserve">covered (equivalent mechanism)</w:t>
+            </w:r>
+          </w:p>
+        </w:tc>
+      </w:tr>
+      <w:tr>
+        <w:tc>
+          <w:tcPr>
+            <w:tcW w:w="2500" w:type="dxa"/>
+            <w:vAlign w:val="center"/>
+          </w:tcPr>
+          <w:p>
+            <w:pPr>
+              <w:spacing w:after="30"/>
+            </w:pPr>
+            <w:r>
+              <w:rPr>
+                <w:sz w:val="15"/>
+                <w:szCs w:val="15"/>
+              </w:rPr>
+              <w:t xml:space="preserve">L2 — analogy transfer trust (Pl_analogy): outcome evidence per run</w:t>
+            </w:r>
+          </w:p>
+        </w:tc>
+        <w:tc>
+          <w:tcPr>
+            <w:tcW w:w="950" w:type="dxa"/>
+            <w:vAlign w:val="center"/>
+          </w:tcPr>
+          <w:p>
+            <w:pPr>
+              <w:spacing w:after="30"/>
+            </w:pPr>
+            <w:r>
+              <w:rPr>
+                <w:sz w:val="15"/>
+                <w:szCs w:val="15"/>
+              </w:rPr>
+              <w:t xml:space="preserve">run</w:t>
+            </w:r>
+          </w:p>
+        </w:tc>
+        <w:tc>
+          <w:tcPr>
+            <w:tcW w:w="4600" w:type="dxa"/>
+            <w:vAlign w:val="center"/>
+          </w:tcPr>
+          <w:p>
+            <w:pPr>
+              <w:spacing w:after="30"/>
+            </w:pPr>
+            <w:r>
+              <w:rPr>
+                <w:sz w:val="15"/>
+                <w:szCs w:val="15"/>
+              </w:rPr>
+              <w:t xml:space="preserve">Per-analogy Dempster–Shafer belief {match, mismatch, Θ} persisted between runs (G1_M2_STATE); spill → mismatch mass, clean run → match mass; Pl &lt; 0.70 blends the ceiling toward conservative, Pl &lt; 0.45 vetoes deployment and corrects the start-up prior</w:t>
+            </w:r>
+          </w:p>
+        </w:tc>
+        <w:tc>
+          <w:tcPr>
+            <w:tcW w:w="1200" w:type="dxa"/>
+            <w:vAlign w:val="center"/>
+          </w:tcPr>
+          <w:p>
+            <w:pPr>
+              <w:spacing w:after="30"/>
+            </w:pPr>
+            <w:r>
+              <w:rPr>
+                <w:sz w:val="15"/>
+                <w:szCs w:val="15"/>
+              </w:rPr>
+              <w:t xml:space="preserve">implemented</w:t>
+            </w:r>
+          </w:p>
+        </w:tc>
+      </w:tr>
+      <w:tr>
+        <w:tc>
+          <w:tcPr>
+            <w:tcW w:w="2500" w:type="dxa"/>
+            <w:vAlign w:val="center"/>
+          </w:tcPr>
+          <w:p>
+            <w:pPr>
+              <w:spacing w:after="30"/>
+            </w:pPr>
+            <w:r>
+              <w:rPr>
+                <w:sz w:val="15"/>
+                <w:szCs w:val="15"/>
+              </w:rPr>
+              <w:t xml:space="preserve">L3 — environment relevance (Pl_env): relax / escalate spatial assumptions</w:t>
+            </w:r>
+          </w:p>
+        </w:tc>
+        <w:tc>
+          <w:tcPr>
+            <w:tcW w:w="950" w:type="dxa"/>
+            <w:vAlign w:val="center"/>
+          </w:tcPr>
+          <w:p>
+            <w:pPr>
+              <w:spacing w:after="30"/>
+            </w:pPr>
+            <w:r>
+              <w:rPr>
+                <w:sz w:val="15"/>
+                <w:szCs w:val="15"/>
+              </w:rPr>
+              <w:t xml:space="preserve">run (continuous)</w:t>
+            </w:r>
+          </w:p>
+        </w:tc>
+        <w:tc>
+          <w:tcPr>
+            <w:tcW w:w="4600" w:type="dxa"/>
+            <w:vAlign w:val="center"/>
+          </w:tcPr>
+          <w:p>
+            <w:pPr>
+              <w:spacing w:after="30"/>
+            </w:pPr>
+            <w:r>
+              <w:rPr>
+                <w:sz w:val="15"/>
+                <w:szCs w:val="15"/>
+              </w:rPr>
+              <w:t xml:space="preserve">EMA of the median clearance relative to the active analogy's expected boundary, clamped to [0.85, 1.15]; scales profile ceilings only (never FALLBACK/HELP; bounds 0.22-0.40). Validated: open environment raises the Cautious ceiling 0.28 → 0.32, narrow lowers it → 0.26</w:t>
+            </w:r>
+          </w:p>
+        </w:tc>
+        <w:tc>
+          <w:tcPr>
+            <w:tcW w:w="1200" w:type="dxa"/>
+            <w:vAlign w:val="center"/>
+          </w:tcPr>
+          <w:p>
+            <w:pPr>
+              <w:spacing w:after="30"/>
+            </w:pPr>
+            <w:r>
+              <w:rPr>
+                <w:sz w:val="15"/>
+                <w:szCs w:val="15"/>
+              </w:rPr>
+              <w:t xml:space="preserve">implemented (opt-in G1_M2_L3)</w:t>
+            </w:r>
+          </w:p>
+        </w:tc>
+      </w:tr>
+      <w:tr>
+        <w:tc>
+          <w:tcPr>
+            <w:tcW w:w="2500" w:type="dxa"/>
+            <w:vAlign w:val="center"/>
+          </w:tcPr>
+          <w:p>
+            <w:pPr>
+              <w:spacing w:after="30"/>
+            </w:pPr>
+            <w:r>
+              <w:rPr>
+                <w:sz w:val="15"/>
+                <w:szCs w:val="15"/>
+              </w:rPr>
+              <w:t xml:space="preserve">L4 — Meta-Attention: chronic low fulfilment despite high trust → profile mismatch</w:t>
+            </w:r>
+          </w:p>
+        </w:tc>
+        <w:tc>
+          <w:tcPr>
+            <w:tcW w:w="950" w:type="dxa"/>
+            <w:vAlign w:val="center"/>
+          </w:tcPr>
+          <w:p>
+            <w:pPr>
+              <w:spacing w:after="30"/>
+            </w:pPr>
+            <w:r>
+              <w:rPr>
+                <w:sz w:val="15"/>
+                <w:szCs w:val="15"/>
+              </w:rPr>
+              <w:t xml:space="preserve">deployment (run window)</w:t>
+            </w:r>
+          </w:p>
+        </w:tc>
+        <w:tc>
+          <w:tcPr>
+            <w:tcW w:w="4600" w:type="dxa"/>
+            <w:vAlign w:val="center"/>
+          </w:tcPr>
+          <w:p>
+            <w:pPr>
+              <w:spacing w:after="30"/>
+            </w:pPr>
+            <w:r>
+              <w:rPr>
+                <w:sz w:val="15"/>
+                <w:szCs w:val="15"/>
+              </w:rPr>
+              <w:t xml:space="preserve">Per-run mean fulfilment history persisted with the L2 state; fulfilment &lt; 0.45 over 3 consecutive runs with Pl ≥ 0.45 under the same profile → start-up re-selection of the alternative profile. The experience-escalation abort (sustained HELP) covers the within-run part of this timescale</w:t>
+            </w:r>
+          </w:p>
+        </w:tc>
+        <w:tc>
+          <w:tcPr>
+            <w:tcW w:w="1200" w:type="dxa"/>
+            <w:vAlign w:val="center"/>
+          </w:tcPr>
+          <w:p>
+            <w:pPr>
+              <w:spacing w:after="30"/>
+            </w:pPr>
+            <w:r>
+              <w:rPr>
+                <w:sz w:val="15"/>
+                <w:szCs w:val="15"/>
+              </w:rPr>
+              <w:t xml:space="preserve">implemented (opt-in G1_M2_L4)</w:t>
+            </w:r>
+          </w:p>
+        </w:tc>
+      </w:tr>
+    </w:tbl>
+    <w:p>
+      <w:pPr>
+        <w:spacing w:after="180" w:line="276" w:lineRule="auto"/>
+      </w:pPr>
+      <w:r>
+        <w:rPr>
+          <w:i/>
+          <w:color w:val="595959"/>
+          <w:sz w:val="18"/>
+          <w:szCs w:val="18"/>
+        </w:rPr>
+        <w:t xml:space="preserve">Table 2. Thesis Ch. 5 four-layer architecture mapped to the G1 runtime. All four layers live in the bridge; the meta-reasoner itself is untouched.</w:t>
+      </w:r>
+    </w:p>
+    <w:p>
+      <w:pPr>
+        <w:spacing w:after="160" w:line="276" w:lineRule="auto"/>
+      </w:pPr>
+      <w:r>
+        <w:t xml:space="preserve">Two details differ from the 2-D study, both additive. First, the </w:t>
+      </w:r>
+      <w:r>
         <w:rPr>
           <w:b/>
         </w:rPr>
-        <w:t xml:space="preserve">Intra-run (fragility channel).</w:t>
-      </w:r>
-      <w:r>
-        <w:t xml:space="preserve"> Each spill drives the fragility meta-parameter: one spill lowers it to caution (≈ 0.52), two to the FALLBACK band (≈ 0.31), three or more into the dangerous region (&lt; 0.12) where the hard veto forces HELP; recovery follows a ~25 s time constant. A spill is a certain event, not a noisy sensor reading, so it bypasses median smoothing.</w:t>
+        <w:t xml:space="preserve">fragility channel acts within the run</w:t>
+      </w:r>
+      <w:r>
+        <w:t xml:space="preserve"> (one spill → caution ≈ 0.52, two → FALLBACK band ≈ 0.31, three or more → dangerous &lt; 0.12 and a hard-veto HELP; ~25 s recovery), which the 2-D study could not do because its spill evidence arrived only per run — the tick-level DST of the runtime makes the intra-run channel possible. Second, spill evidence is attributed to the analogy </w:t>
+      </w:r>
+      <w:r>
+        <w:rPr>
+          <w:b/>
+        </w:rPr>
+        <w:t xml:space="preserve">governing at the moment of the spill</w:t>
+      </w:r>
+      <w:r>
+        <w:t xml:space="preserve">, not to the whole run, sharpening the Layer-2 credit assignment.</w:t>
+      </w:r>
+    </w:p>
+    <w:p>
+      <w:pPr>
+        <w:spacing w:after="100" w:line="276" w:lineRule="auto"/>
+      </w:pPr>
+      <w:r>
+        <w:rPr>
+          <w:b/>
+          <w:color w:val="2E74B5"/>
+          <w:sz w:val="26"/>
+          <w:szCs w:val="26"/>
+        </w:rPr>
+        <w:t xml:space="preserve">3.2  Runtime certification ratio (ρ_DCA)</w:t>
       </w:r>
     </w:p>
     <w:p>
@@ -765,13 +1214,29 @@
         <w:spacing w:after="160" w:line="276" w:lineRule="auto"/>
       </w:pPr>
       <w:r>
-        <w:rPr>
-          <w:b/>
-        </w:rPr>
-        <w:t xml:space="preserve">Cross-run (Layer 2).</w:t>
-      </w:r>
-      <w:r>
-        <w:t xml:space="preserve"> A per-analogy Dempster–Shafer belief over {match, mismatch, Θ} is persisted between runs. At each run's end, outcome evidence is fused by Dempster's rule: a spill under analogy A adds mismatch mass to A; a clean run adds match mass to the governing analogy. Plausibility Pl = m(match) + m(Θ) gates deployment: below 0.70 the analogy's ceiling is blended toward the conservative policy (the thesis policy blend); below 0.45 it is not deployed, and a discredited initial prior is replaced at start-up (zero-shot correction). The reasoner itself is untouched; both layers live in the bridge.</w:t>
+        <w:t xml:space="preserve">The paper's robustness certificate is instantiated as a runtime quantity and logged with every governance decision:</w:t>
+      </w:r>
+    </w:p>
+    <w:p>
+      <w:pPr>
+        <w:spacing w:after="120" w:line="276" w:lineRule="auto"/>
+      </w:pPr>
+      <w:r>
+        <w:rPr>
+          <w:rFonts w:ascii="Consolas" w:hAnsi="Consolas"/>
+          <w:color w:val="333333"/>
+          <w:sz w:val="18"/>
+          <w:szCs w:val="18"/>
+        </w:rPr>
+        <w:t xml:space="preserve">ρ̂ = max(0, Δmargin) / ( task_uncertainty_gap(winner) + 0.5·θ_mismatch(winner) + 0.02 )</w:t>
+      </w:r>
+    </w:p>
+    <w:p>
+      <w:pPr>
+        <w:spacing w:after="160" w:line="276" w:lineRule="auto"/>
+      </w:pPr>
+      <w:r>
+        <w:t xml:space="preserve">where Δmargin is the stable-fulfilment gap between the two best deployable candidates (or the distance to the certification threshold when only one is deployable), task_uncertainty_gap is the DST-measured calibration budget (the θ_QoE proxy), and θ_mismatch is the L2 distance between normalised task and analogy attention vectors (computed from configuration; B constants set to 1 and ξ_rep declared unmeasured at runtime). Validation reproduces the paper's regimes empirically: ρ̂ = 1.50 in an open corridor with clean readings (stable) versus ρ̂ = 0.58 under degraded, oscillating readings (non-certifiable). The value is recorded per tick (meta2_rho) so certification traces analogous to Table V of the manuscript can be produced from any run.</w:t>
       </w:r>
     </w:p>
     <w:p>
@@ -823,7 +1288,7 @@
         <w:spacing w:after="160" w:line="276" w:lineRule="auto"/>
       </w:pPr>
       <w:r>
-        <w:t xml:space="preserve">Table 1 reports all eleven arms. Risk is the fraction of run time with the liquid surface above 70% of freeboard; HELP counts governed aborts (sustained empty deployable set); times average reached runs only.</w:t>
+        <w:t xml:space="preserve">Table 3 reports all eleven arms. Risk is the fraction of run time with the liquid surface above 70% of freeboard; HELP counts governed aborts (sustained empty deployable set); times average reached runs only.</w:t>
       </w:r>
     </w:p>
     <w:tbl>
@@ -2207,7 +2672,7 @@
           <w:sz w:val="18"/>
           <w:szCs w:val="18"/>
         </w:rPr>
-        <w:t xml:space="preserve">Table 1. Full campaign results (82 valid runs). Lab-QoE = QoE boundaries calibrated on the physical laboratory; twin-QoE = re-calibrated from measured twin distributions.</w:t>
+        <w:t xml:space="preserve">Table 3. Full campaign results (82 valid runs). Lab-QoE = QoE boundaries calibrated on the physical laboratory; twin-QoE = re-calibrated from measured twin distributions.</w:t>
       </w:r>
     </w:p>
     <w:p>
@@ -2528,7 +2993,7 @@
         <w:t xml:space="preserve">Finding 5 — temporal scales separate as designed</w:t>
       </w:r>
       <w:r>
-        <w:t xml:space="preserve"> (Fig. 5): in the twin campaign the Wrong-DST arms show flat, spill-free sequences because per-tick shared-experience evidence corrects the task-blind prior within ≈ 4 s of each run — before any spill can occur — so the run-level trust layer receives no failure signal. The mechanism itself is validated in the controlled trace of Fig. 5. Its operational regime is the physical laboratory, where open-floor cruising genuinely certifies the fast capability and gait-induced spills are invisible to per-tick channels; the twenty-run physical campaign exercises it.</w:t>
+        <w:t xml:space="preserve"> (Fig. 5): in the twin campaign the Wrong-DST arms show flat, spill-free sequences because per-tick shared-experience evidence (the Layer-1 timescale) corrects the task-blind prior within ≈ 4 s of each run — before any spill can occur — so the run-level trust layer receives no failure signal. The mechanism itself is validated in the controlled trace of Fig. 5. Its operational regime is the physical laboratory, where open-floor cruising genuinely certifies the fast capability and gait-induced spills are invisible to per-tick channels; the twenty-run physical campaign exercises it.</w:t>
       </w:r>
     </w:p>
     <w:p>
@@ -2556,7 +3021,7 @@
           <w:sz w:val="20"/>
           <w:szCs w:val="20"/>
         </w:rPr>
-        <w:t xml:space="preserve">Datasets, configurations, the aggregation script and figure-generation code are versioned with the robot stack (commits up to the 2026-07-04 campaign).</w:t>
+        <w:t xml:space="preserve">Datasets, configurations, the aggregation script and figure-generation code are versioned with the robot stack (commits up to the 2026-07-04 campaign; four-layer architecture and runtime certification ratio added in rev. 2).</w:t>
       </w:r>
     </w:p>
     <w:sectPr>

</xml_diff>

<commit_message>
docs rev.3: auditoria de consistencia claim-por-claim (paper + tesis), seccion 5.1 pre-real y traza viva de rho (Fig. 6)
- Seccion 6: matriz de auditoria — 5 claims del paper (4 confirmadas con
  estadistica/observacion, rho confirmada ordinalmente con calibracion de B
  pendiente en robot) + 6 claims de la tesis (5 confirmadas, multi-entorno
  fuera de alcance del gemelo y cubierta por la sim 2D).
- 5.1: tanda pre-real (4/4, 0 derrames, L3 sin oscilacion, ~10% de tiempo
  recuperado) + Fig. 6 con la LECTURA CORREGIDA de rho: certifica robustez
  de la DECISION, no seguridad de la situacion (alto en puerta p50=1.25,
  frontera en crucero por el laser parpadeante) — consistente con la teoria
  leida al nivel correcto.

Co-Authored-By: Claude Fable 5 <noreply@anthropic.com>
</commit_message>
<xml_diff>
--- a/docs/G1_Empirical_Validation_VIIH_draft.docx
+++ b/docs/G1_Empirical_Validation_VIIH_draft.docx
@@ -27,7 +27,7 @@
           <w:sz w:val="22"/>
           <w:szCs w:val="22"/>
         </w:rPr>
-        <w:t xml:space="preserve">Methods, spill model, governance algorithm and full campaign results — supporting material for Section VII.H</w:t>
+        <w:t xml:space="preserve">Methods, spill model, governance algorithm, full campaign results and theory-consistency audit — supporting material for Section VII.H</w:t>
       </w:r>
     </w:p>
     <w:p>
@@ -41,7 +41,7 @@
           <w:sz w:val="20"/>
           <w:szCs w:val="20"/>
         </w:rPr>
-        <w:t xml:space="preserve">Simulation campaign 2026-07-04 · Unitree G1 · Gazebo (ROS 2 Humble) · 99 simulation runs, 82 valid formal-campaign runs across 11 arms · rev. 2 (four-layer architecture + runtime certification ratio)</w:t>
+        <w:t xml:space="preserve">Simulation campaigns 2026-07-04 · Unitree G1 · Gazebo (ROS 2 Humble) · 103 simulation runs, 86 valid governed/baseline runs across 12 arms · rev. 3 (adds pre-deployment validation of the four-layer configuration, live ρ̂ traces, and the claim-by-claim consistency audit)</w:t>
       </w:r>
     </w:p>
     <w:p>
@@ -751,7 +751,7 @@
         <w:spacing w:after="160" w:line="276" w:lineRule="auto"/>
       </w:pPr>
       <w:r>
-        <w:t xml:space="preserve">Chapter 5 of the thesis specifies three DST belief layers plus a deployment-level Meta-Attention layer, each addressing a distinct failure mode at its own timescale. Table 2 maps each layer to its realisation on the G1. Layers 1-2 run in every governed experiment; Layers 3-4 are implemented and validated but opt-in (they were disabled during the reported campaign so that the published arms remain exactly reproducible).</w:t>
+        <w:t xml:space="preserve">Chapter 5 of the thesis specifies three DST belief layers plus a deployment-level Meta-Attention layer, each addressing a distinct failure mode at its own timescale. Table 2 maps each layer to its realisation on the G1. Layers 1-2 ran in every governed campaign arm; Layers 3-4 are opt-in (disabled during the reported campaign so the published arms remain exactly reproducible) and were validated in the loop by the pre-deployment arm of §5.1.</w:t>
       </w:r>
     </w:p>
     <w:tbl>
@@ -1001,7 +1001,7 @@
                 <w:sz w:val="15"/>
                 <w:szCs w:val="15"/>
               </w:rPr>
-              <w:t xml:space="preserve">implemented</w:t>
+              <w:t xml:space="preserve">implemented; exercised in campaign</w:t>
             </w:r>
           </w:p>
         </w:tc>
@@ -1057,7 +1057,7 @@
                 <w:sz w:val="15"/>
                 <w:szCs w:val="15"/>
               </w:rPr>
-              <w:t xml:space="preserve">EMA of the median clearance relative to the active analogy's expected boundary, clamped to [0.85, 1.15]; scales profile ceilings only (never FALLBACK/HELP; bounds 0.22-0.40). Validated: open environment raises the Cautious ceiling 0.28 → 0.32, narrow lowers it → 0.26</w:t>
+              <w:t xml:space="preserve">EMA of the median clearance relative to the active analogy's expected boundary, clamped to [0.85, 1.15]; scales profile ceilings only (never FALLBACK/HELP; bounds 0.22-0.40)</w:t>
             </w:r>
           </w:p>
         </w:tc>
@@ -1075,7 +1075,7 @@
                 <w:sz w:val="15"/>
                 <w:szCs w:val="15"/>
               </w:rPr>
-              <w:t xml:space="preserve">implemented (opt-in G1_M2_L3)</w:t>
+              <w:t xml:space="preserve">implemented; in-loop validated (§5.1)</w:t>
             </w:r>
           </w:p>
         </w:tc>
@@ -1131,7 +1131,7 @@
                 <w:sz w:val="15"/>
                 <w:szCs w:val="15"/>
               </w:rPr>
-              <w:t xml:space="preserve">Per-run mean fulfilment history persisted with the L2 state; fulfilment &lt; 0.45 over 3 consecutive runs with Pl ≥ 0.45 under the same profile → start-up re-selection of the alternative profile. The experience-escalation abort (sustained HELP) covers the within-run part of this timescale</w:t>
+              <w:t xml:space="preserve">Per-run mean fulfilment history persisted with the L2 state; fulfilment &lt; 0.45 over 3 consecutive runs with Pl ≥ 0.45 under the same profile → start-up re-selection of the alternative profile. The experience-escalation abort covers the within-run part of this timescale</w:t>
             </w:r>
           </w:p>
         </w:tc>
@@ -1149,7 +1149,7 @@
                 <w:sz w:val="15"/>
                 <w:szCs w:val="15"/>
               </w:rPr>
-              <w:t xml:space="preserve">implemented (opt-in G1_M2_L4)</w:t>
+              <w:t xml:space="preserve">implemented; in-loop validated (§5.1)</w:t>
             </w:r>
           </w:p>
         </w:tc>
@@ -1183,7 +1183,7 @@
         <w:t xml:space="preserve">fragility channel acts within the run</w:t>
       </w:r>
       <w:r>
-        <w:t xml:space="preserve"> (one spill → caution ≈ 0.52, two → FALLBACK band ≈ 0.31, three or more → dangerous &lt; 0.12 and a hard-veto HELP; ~25 s recovery), which the 2-D study could not do because its spill evidence arrived only per run — the tick-level DST of the runtime makes the intra-run channel possible. Second, spill evidence is attributed to the analogy </w:t>
+        <w:t xml:space="preserve"> (one spill → caution ≈ 0.52, two → FALLBACK band ≈ 0.31, three or more → dangerous &lt; 0.12 and a hard-veto HELP; ~25 s recovery), which the 2-D study could not do because its spill evidence arrived only per run. Second, spill evidence is attributed to the analogy </w:t>
       </w:r>
       <w:r>
         <w:rPr>
@@ -1192,7 +1192,7 @@
         <w:t xml:space="preserve">governing at the moment of the spill</w:t>
       </w:r>
       <w:r>
-        <w:t xml:space="preserve">, not to the whole run, sharpening the Layer-2 credit assignment.</w:t>
+        <w:t xml:space="preserve">, sharpening the Layer-2 credit assignment.</w:t>
       </w:r>
     </w:p>
     <w:p>
@@ -1236,7 +1236,7 @@
         <w:spacing w:after="160" w:line="276" w:lineRule="auto"/>
       </w:pPr>
       <w:r>
-        <w:t xml:space="preserve">where Δmargin is the stable-fulfilment gap between the two best deployable candidates (or the distance to the certification threshold when only one is deployable), task_uncertainty_gap is the DST-measured calibration budget (the θ_QoE proxy), and θ_mismatch is the L2 distance between normalised task and analogy attention vectors (computed from configuration; B constants set to 1 and ξ_rep declared unmeasured at runtime). Validation reproduces the paper's regimes empirically: ρ̂ = 1.50 in an open corridor with clean readings (stable) versus ρ̂ = 0.58 under degraded, oscillating readings (non-certifiable). The value is recorded per tick (meta2_rho) so certification traces analogous to Table V of the manuscript can be produced from any run.</w:t>
+        <w:t xml:space="preserve">where Δmargin is the stable-fulfilment gap between the two best deployable candidates (or the distance to the certification threshold when only one is deployable), task_uncertainty_gap is the DST-measured calibration budget (the θ_QoE proxy), and θ_mismatch is the L2 distance between normalised task and analogy attention vectors (B constants set to 1; ξ_rep declared unmeasured at runtime). Controlled validation reproduces the paper's regimes: ρ̂ = 1.50 with clean readings versus ρ̂ = 0.58 under degraded, oscillating readings. Live traces are analysed in §5.1.</w:t>
       </w:r>
     </w:p>
     <w:p>
@@ -1266,7 +1266,7 @@
         <w:spacing w:after="160" w:line="276" w:lineRule="auto"/>
       </w:pPr>
       <w:r>
-        <w:t xml:space="preserve">99 simulation runs were executed in total: 82 valid formal-campaign runs across 11 governance arms (8 per arm; 6 for sealed-lid arms), plus development and validation runs (adapter bring-up, collision-physics correction, smoke tests) and one run excluded by audit (governance silently disabled by a mid-campaign code edit — detected by a per-tick telemetry check and discarded). Every run resets Gazebo to a fresh world with the robot at waypoint A and executes an autonomous A→B traverse headless; arms alternate to share machine-load drift; datasets are tagged env=sim with a per-arm identifier. Statistics follow the thesis protocol: mean ± 95% CI (1.96·s/√n).</w:t>
+        <w:t xml:space="preserve">103 simulation runs were executed in total: 82 valid formal-campaign runs across 11 governance arms (8 per arm; 6 for sealed-lid arms), a 4-run pre-deployment validation arm (§5.1), plus development and validation runs, and one run excluded by audit (governance silently disabled by a mid-campaign code edit — detected by a per-tick telemetry check and discarded). Every run resets Gazebo to a fresh world with the robot at waypoint A and executes an autonomous A→B traverse headless; arms alternate to share machine-load drift; datasets are tagged env=sim with a per-arm identifier. Statistics follow the thesis protocol: mean ± 95% CI (1.96·s/√n).</w:t>
       </w:r>
     </w:p>
     <w:p>
@@ -1288,7 +1288,7 @@
         <w:spacing w:after="160" w:line="276" w:lineRule="auto"/>
       </w:pPr>
       <w:r>
-        <w:t xml:space="preserve">Table 3 reports all eleven arms. Risk is the fraction of run time with the liquid surface above 70% of freeboard; HELP counts governed aborts (sustained empty deployable set); times average reached runs only.</w:t>
+        <w:t xml:space="preserve">Table 3 reports all eleven formal arms. Risk is the fraction of run time with the liquid surface above 70% of freeboard; HELP counts governed aborts (sustained empty deployable set); times average reached runs only.</w:t>
       </w:r>
     </w:p>
     <w:tbl>
@@ -2794,7 +2794,7 @@
         <w:t xml:space="preserve">Finding 1 — deployability governance converts spills into bounded time cost</w:t>
       </w:r>
       <w:r>
-        <w:t xml:space="preserve"> (Fig. 1): M0 spills 0.50/run at 8.1% exposure; M2 payload governance eliminates spills (0/8; 0.4%) at +29% time with 8/8 completion. </w:t>
+        <w:t xml:space="preserve"> (Fig. 1). </w:t>
       </w:r>
       <w:r>
         <w:rPr>
@@ -2803,7 +2803,7 @@
         <w:t xml:space="preserve">Finding 2 — HELP semantics</w:t>
       </w:r>
       <w:r>
-        <w:t xml:space="preserve">: with a single-analogy candidate set, a mobility hard veto while pressing the corridor pinch empties the deployable set; sustained HELP aborts the run (3/8). This is the specified conservative non-selection behaviour, not a failure.</w:t>
+        <w:t xml:space="preserve">: a mobility hard veto with a single-analogy candidate set empties the deployable set; sustained HELP aborts the run (3/8) — the specified conservative non-selection behaviour, not a failure.</w:t>
       </w:r>
     </w:p>
     <w:p>
@@ -2857,21 +2857,7 @@
           <w:sz w:val="18"/>
           <w:szCs w:val="18"/>
         </w:rPr>
-        <w:t xml:space="preserve">Figure 3. The calibration-limited regime, observed live. The physical-lab QoE boundary for the efficient capability (0.75) sits above the twin’s cruise clearance distribution: the capability is never certifiable on the twin until the boundary is re-calibrated from measured distributions (0.60), per the interface-refinement pattern.</w:t>
-      </w:r>
-    </w:p>
-    <w:p>
-      <w:pPr>
-        <w:spacing w:after="160" w:line="276" w:lineRule="auto"/>
-      </w:pPr>
-      <w:r>
-        <w:rPr>
-          <w:b/>
-        </w:rPr>
-        <w:t xml:space="preserve">Finding 3 — θ_QoE in deployment</w:t>
-      </w:r>
-      <w:r>
-        <w:t xml:space="preserve"> (Fig. 3): the twin's clearance distribution is systematically narrower than the physical laboratory's; running the lab calibration unchanged leaves Efficient_Nav non-certifiable for entire runs. Re-calibration restored certification in open stretches without touching the reasoner or the physical-robot configuration.</w:t>
+        <w:t xml:space="preserve">Figure 3. The calibration-limited regime, observed live: the physical-lab QoE boundary (0.75) sits above the twin’s cruise clearance distribution; re-calibration from measured distributions (0.60) restores certification, per the interface-refinement pattern.</w:t>
       </w:r>
     </w:p>
     <w:p>
@@ -2925,7 +2911,7 @@
           <w:sz w:val="18"/>
           <w:szCs w:val="18"/>
         </w:rPr>
-        <w:t xml:space="preserve">Figure 4. Lid-state deltas. The ungoverned baseline improves only through physics (fewer realised spills, identical exposure); the twin-calibrated governed system also converts the sealed lid into speed (102.5 ± 2.2 s vs 111.5 ± 7.3 s), a policy-level exploitation unavailable to fixed baselines.</w:t>
+        <w:t xml:space="preserve">Figure 4. Lid-state deltas: passive physics for the ungoverned baseline versus policy-level exploitation by the twin-calibrated governed system (102.5 ± 2.2 s vs 111.5 ± 7.3 s).</w:t>
       </w:r>
     </w:p>
     <w:p>
@@ -2979,7 +2965,21 @@
           <w:sz w:val="18"/>
           <w:szCs w:val="18"/>
         </w:rPr>
-        <w:t xml:space="preserve">Figure 5. Cross-run analogical trust (Layer 2), mechanistic validation. Under a forced wrong prior with spills attributed to it, plausibility degrades 1.00 → 0.75 → 0.53 → 0.36 by Dempster fusion; crossing the blend threshold (0.70) progressively caps the analogy’s speed, and crossing the deployment veto (0.45) makes run 4 start pre-corrected in the conservative analogy.</w:t>
+        <w:t xml:space="preserve">Figure 5. Cross-run analogical trust (Layer 2), mechanistic validation: plausibility degrades 1.00 → 0.75 → 0.53 → 0.36 under a forced wrong prior, and run 4 starts pre-corrected.</w:t>
+      </w:r>
+    </w:p>
+    <w:p>
+      <w:pPr>
+        <w:spacing w:after="100" w:line="276" w:lineRule="auto"/>
+      </w:pPr>
+      <w:r>
+        <w:rPr>
+          <w:b/>
+          <w:color w:val="2E74B5"/>
+          <w:sz w:val="26"/>
+          <w:szCs w:val="26"/>
+        </w:rPr>
+        <w:t xml:space="preserve">5.1  Pre-deployment validation of the full four-layer configuration</w:t>
       </w:r>
     </w:p>
     <w:p>
@@ -2987,13 +2987,70 @@
         <w:spacing w:after="160" w:line="276" w:lineRule="auto"/>
       </w:pPr>
       <w:r>
+        <w:t xml:space="preserve">Before the physical campaign, the exact configuration recommended for the real robot (Layers 1-4 active, belief state persisted across runs, ρ̂ logged) ran a dedicated 4-run arm. All four runs reached the goal with </w:t>
+      </w:r>
+      <w:r>
         <w:rPr>
           <w:b/>
         </w:rPr>
-        <w:t xml:space="preserve">Finding 5 — temporal scales separate as designed</w:t>
-      </w:r>
-      <w:r>
-        <w:t xml:space="preserve"> (Fig. 5): in the twin campaign the Wrong-DST arms show flat, spill-free sequences because per-tick shared-experience evidence (the Layer-1 timescale) corrects the task-blind prior within ≈ 4 s of each run — before any spill can occur — so the run-level trust layer receives no failure signal. The mechanism itself is validated in the controlled trace of Fig. 5. Its operational regime is the physical laboratory, where open-floor cruising genuinely certifies the fast capability and gait-induced spills are invisible to per-tick channels; the twenty-run physical campaign exercises it.</w:t>
+        <w:t xml:space="preserve">zero spills and zero governed aborts</w:t>
+      </w:r>
+      <w:r>
+        <w:t xml:space="preserve"> (mean time 97.4 ± 5.6 s; risk 1.5 ± 0.7%). Layer 3 modulated the profile ceiling within [0.24, 0.32] without oscillation (only 2.7-2.8% of consecutive decisions changed the ceiling by more than 0.005), and recovered roughly a third of the governance time cost relative to the plain payload arm (97.4 s vs 107.9 s) while the surface never crossed the spill threshold (peak |η|/freeboard ≤ 0.99). The persisted state remained healthy: both plausibilities at 1.0 after four clean runs and per-run fulfilment 0.72-0.77, far above the Layer-4 mismatch threshold — no false profile re-selection.</w:t>
+      </w:r>
+    </w:p>
+    <w:p>
+      <w:pPr>
+        <w:jc w:val="center"/>
+        <w:spacing w:after="60"/>
+      </w:pPr>
+      <w:r>
+        <w:drawing>
+          <wp:inline xmlns:wp="http://schemas.openxmlformats.org/drawingml/2006/wordprocessingDrawing" distT="0" distB="0" distL="0" distR="0">
+            <wp:extent cx="5157216" cy="3127248"/>
+            <wp:docPr id="6" name="Fig6"/>
+            <a:graphic xmlns:a="http://schemas.openxmlformats.org/drawingml/2006/main">
+              <a:graphicData uri="http://schemas.openxmlformats.org/drawingml/2006/picture">
+                <pic:pic xmlns:pic="http://schemas.openxmlformats.org/drawingml/2006/picture">
+                  <pic:nvPicPr>
+                    <pic:cNvPr id="6" name="Fig6"/>
+                    <pic:cNvPicPr/>
+                  </pic:nvPicPr>
+                  <pic:blipFill>
+                    <a:blip xmlns:r="http://schemas.openxmlformats.org/officeDocument/2006/relationships" r:embed="rIdImg6"/>
+                    <a:stretch>
+                      <a:fillRect/>
+                    </a:stretch>
+                  </pic:blipFill>
+                  <pic:spPr>
+                    <a:xfrm>
+                      <a:off x="0" y="0"/>
+                      <a:ext cx="5157216" cy="3127248"/>
+                    </a:xfrm>
+                    <a:prstGeom prst="rect">
+                      <a:avLst/>
+                    </a:prstGeom>
+                  </pic:spPr>
+                </pic:pic>
+              </a:graphicData>
+            </a:graphic>
+          </wp:inline>
+        </w:drawing>
+      </w:r>
+    </w:p>
+    <w:p>
+      <w:pPr>
+        <w:spacing w:after="220" w:line="276" w:lineRule="auto"/>
+        <w:jc w:val="center"/>
+      </w:pPr>
+      <w:r>
+        <w:rPr>
+          <w:i/>
+          <w:color w:val="595959"/>
+          <w:sz w:val="18"/>
+          <w:szCs w:val="18"/>
+        </w:rPr>
+        <w:t xml:space="preserve">Figure 6. Live ρ̂ trace from a pre-deployment run. The ratio is HIGH inside the corridor/doorway (median 1.25: readings are steady, the conservative decision is unambiguous — certified) and LOW in open cruising (median ≈ 0.4: clearance flickers, the DST intervals widen, and the fast-versus-careful arbitration is genuinely fragile — boundary regime). The certificate flags where arbitration is vulnerable, not where the environment is dangerous.</w:t>
       </w:r>
     </w:p>
     <w:p>
@@ -3001,13 +3058,870 @@
         <w:spacing w:after="160" w:line="276" w:lineRule="auto"/>
       </w:pPr>
       <w:r>
+        <w:t xml:space="preserve">The live trace refines the reading of ρ̂: it certifies </w:t>
+      </w:r>
+      <w:r>
         <w:rPr>
           <w:b/>
         </w:rPr>
-        <w:t xml:space="preserve">Fidelity to theory.</w:t>
-      </w:r>
-      <w:r>
-        <w:t xml:space="preserve"> Four of the five claims instantiated by the campaign are confirmed with statistics (Findings 1-4); the fifth is confirmed mechanistically with its operational regime correctly predicted to lie on the physical robot. Two artefacts were caught and corrected by consistency checking before affecting conclusions: a run with governance silently disabled (excluded) and a single-candidate arm originally mislabelled as the M1 baseline (retained as the HELP-semantics arm; a true fixed-cap M1 was added).</w:t>
+        <w:t xml:space="preserve">decision robustness</w:t>
+      </w:r>
+      <w:r>
+        <w:t xml:space="preserve">, not situational safety. In the doorway the world is unambiguous and the decision margin dwarfs the perturbation budget; in open stretches the flickering laser widens the few-shot DST margins and the arbitration between profiles is genuinely contestable — exactly the conservative behaviour the theory prescribes (hysteresis holds the incumbent; FALLBACK bursts concentrate there). The absolute scale of ρ̂ depends on the instantiation constants (B = 1); calibrating them so that ρ̂ ≥ 1 empirically coincides with decisions that never need reversal is a planned exercise over the physical-robot traces.</w:t>
+      </w:r>
+    </w:p>
+    <w:p>
+      <w:pPr>
+        <w:spacing w:after="120"/>
+      </w:pPr>
+      <w:r>
+        <w:br w:type="page"/>
+      </w:r>
+    </w:p>
+    <w:p>
+      <w:pPr>
+        <w:spacing w:after="80" w:line="276" w:lineRule="auto"/>
+      </w:pPr>
+      <w:r>
+        <w:rPr>
+          <w:b/>
+          <w:color w:val="1F3864"/>
+          <w:sz w:val="32"/>
+          <w:szCs w:val="32"/>
+        </w:rPr>
+        <w:t xml:space="preserve">6.  Consistency with theory: claim-by-claim audit</w:t>
+      </w:r>
+    </w:p>
+    <w:p>
+      <w:pPr>
+        <w:spacing w:after="160" w:line="276" w:lineRule="auto"/>
+      </w:pPr>
+      <w:r>
+        <w:t xml:space="preserve">Every claim that the campaign instantiates is listed below with its verdict. No claim was found inconsistent; two artefacts were caught by the audit process itself and corrected before affecting conclusions (a run with governance silently disabled, excluded; and a single-candidate arm originally mislabelled as the M1 baseline, retained instead as the HELP-semantics arm).</w:t>
+      </w:r>
+    </w:p>
+    <w:p>
+      <w:pPr>
+        <w:spacing w:after="100" w:line="276" w:lineRule="auto"/>
+      </w:pPr>
+      <w:r>
+        <w:rPr>
+          <w:b/>
+          <w:color w:val="2E74B5"/>
+          <w:sz w:val="26"/>
+          <w:szCs w:val="26"/>
+        </w:rPr>
+        <w:t xml:space="preserve">6.1  Paper (Decentralised Capability Abstraction)</w:t>
+      </w:r>
+    </w:p>
+    <w:tbl>
+      <w:tblPr>
+        <w:tblW w:w="9250" w:type="dxa"/>
+        <w:tblBorders>
+          <w:top w:val="single" w:sz="4" w:color="8EAADB"/>
+          <w:left w:val="single" w:sz="4" w:color="8EAADB"/>
+          <w:bottom w:val="single" w:sz="4" w:color="8EAADB"/>
+          <w:right w:val="single" w:sz="4" w:color="8EAADB"/>
+          <w:insideH w:val="single" w:sz="4" w:color="8EAADB"/>
+          <w:insideV w:val="single" w:sz="4" w:color="8EAADB"/>
+        </w:tblBorders>
+      </w:tblPr>
+      <w:tblGrid>
+        <w:gridCol w:w="3300"/>
+        <w:gridCol w:w="4100"/>
+        <w:gridCol w:w="1850"/>
+      </w:tblGrid>
+      <w:tr>
+        <w:tc>
+          <w:tcPr>
+            <w:tcW w:w="3300" w:type="dxa"/>
+            <w:shd w:val="clear" w:color="auto" w:fill="1F3864"/>
+            <w:vAlign w:val="center"/>
+          </w:tcPr>
+          <w:p>
+            <w:pPr>
+              <w:spacing w:after="30"/>
+            </w:pPr>
+            <w:r>
+              <w:rPr>
+                <w:b/>
+                <w:color w:val="FFFFFF"/>
+                <w:sz w:val="15"/>
+                <w:szCs w:val="15"/>
+              </w:rPr>
+              <w:t xml:space="preserve">Claim</w:t>
+            </w:r>
+          </w:p>
+        </w:tc>
+        <w:tc>
+          <w:tcPr>
+            <w:tcW w:w="4100" w:type="dxa"/>
+            <w:shd w:val="clear" w:color="auto" w:fill="1F3864"/>
+            <w:vAlign w:val="center"/>
+          </w:tcPr>
+          <w:p>
+            <w:pPr>
+              <w:spacing w:after="30"/>
+            </w:pPr>
+            <w:r>
+              <w:rPr>
+                <w:b/>
+                <w:color w:val="FFFFFF"/>
+                <w:sz w:val="15"/>
+                <w:szCs w:val="15"/>
+              </w:rPr>
+              <w:t xml:space="preserve">Evidence</w:t>
+            </w:r>
+          </w:p>
+        </w:tc>
+        <w:tc>
+          <w:tcPr>
+            <w:tcW w:w="1850" w:type="dxa"/>
+            <w:shd w:val="clear" w:color="auto" w:fill="1F3864"/>
+            <w:vAlign w:val="center"/>
+          </w:tcPr>
+          <w:p>
+            <w:pPr>
+              <w:spacing w:after="30"/>
+            </w:pPr>
+            <w:r>
+              <w:rPr>
+                <w:b/>
+                <w:color w:val="FFFFFF"/>
+                <w:sz w:val="15"/>
+                <w:szCs w:val="15"/>
+              </w:rPr>
+              <w:t xml:space="preserve">Verdict</w:t>
+            </w:r>
+          </w:p>
+        </w:tc>
+      </w:tr>
+      <w:tr>
+        <w:tc>
+          <w:tcPr>
+            <w:tcW w:w="3300" w:type="dxa"/>
+            <w:vAlign w:val="center"/>
+          </w:tcPr>
+          <w:p>
+            <w:pPr>
+              <w:spacing w:after="30"/>
+            </w:pPr>
+            <w:r>
+              <w:rPr>
+                <w:sz w:val="15"/>
+                <w:szCs w:val="15"/>
+              </w:rPr>
+              <w:t xml:space="preserve">Availability ≠ deployability: governance certifies capabilities against current experience, not reachability</w:t>
+            </w:r>
+          </w:p>
+        </w:tc>
+        <w:tc>
+          <w:tcPr>
+            <w:tcW w:w="4100" w:type="dxa"/>
+            <w:vAlign w:val="center"/>
+          </w:tcPr>
+          <w:p>
+            <w:pPr>
+              <w:spacing w:after="30"/>
+            </w:pPr>
+            <w:r>
+              <w:rPr>
+                <w:sz w:val="15"/>
+                <w:szCs w:val="15"/>
+              </w:rPr>
+              <w:t xml:space="preserve">Governed arms de-certify the fast capability by context; 0.50 → 0.00 spills/run at +29% time, 8/8 completion (Table 3, Fig. 1)</w:t>
+            </w:r>
+          </w:p>
+        </w:tc>
+        <w:tc>
+          <w:tcPr>
+            <w:tcW w:w="1850" w:type="dxa"/>
+            <w:vAlign w:val="center"/>
+          </w:tcPr>
+          <w:p>
+            <w:pPr>
+              <w:spacing w:after="30"/>
+            </w:pPr>
+            <w:r>
+              <w:rPr>
+                <w:sz w:val="15"/>
+                <w:szCs w:val="15"/>
+              </w:rPr>
+              <w:t xml:space="preserve">Confirmed (statistical)</w:t>
+            </w:r>
+          </w:p>
+        </w:tc>
+      </w:tr>
+      <w:tr>
+        <w:tc>
+          <w:tcPr>
+            <w:tcW w:w="3300" w:type="dxa"/>
+            <w:vAlign w:val="center"/>
+          </w:tcPr>
+          <w:p>
+            <w:pPr>
+              <w:spacing w:after="30"/>
+            </w:pPr>
+            <w:r>
+              <w:rPr>
+                <w:sz w:val="15"/>
+                <w:szCs w:val="15"/>
+              </w:rPr>
+              <w:t xml:space="preserve">Conservative non-selection: an empty deployable set must yield FALLBACK/HELP, never silent persistence</w:t>
+            </w:r>
+          </w:p>
+        </w:tc>
+        <w:tc>
+          <w:tcPr>
+            <w:tcW w:w="4100" w:type="dxa"/>
+            <w:vAlign w:val="center"/>
+          </w:tcPr>
+          <w:p>
+            <w:pPr>
+              <w:spacing w:after="30"/>
+            </w:pPr>
+            <w:r>
+              <w:rPr>
+                <w:sz w:val="15"/>
+                <w:szCs w:val="15"/>
+              </w:rPr>
+              <w:t xml:space="preserve">Single-candidate arm: mobility hard veto at the corridor pinch → sustained HELP → governed abort (3/8); same semantics in 3 further lid-arm runs</w:t>
+            </w:r>
+          </w:p>
+        </w:tc>
+        <w:tc>
+          <w:tcPr>
+            <w:tcW w:w="1850" w:type="dxa"/>
+            <w:vAlign w:val="center"/>
+          </w:tcPr>
+          <w:p>
+            <w:pPr>
+              <w:spacing w:after="30"/>
+            </w:pPr>
+            <w:r>
+              <w:rPr>
+                <w:sz w:val="15"/>
+                <w:szCs w:val="15"/>
+              </w:rPr>
+              <w:t xml:space="preserve">Confirmed (semantics observed)</w:t>
+            </w:r>
+          </w:p>
+        </w:tc>
+      </w:tr>
+      <w:tr>
+        <w:tc>
+          <w:tcPr>
+            <w:tcW w:w="3300" w:type="dxa"/>
+            <w:vAlign w:val="center"/>
+          </w:tcPr>
+          <w:p>
+            <w:pPr>
+              <w:spacing w:after="30"/>
+            </w:pPr>
+            <w:r>
+              <w:rPr>
+                <w:sz w:val="15"/>
+                <w:szCs w:val="15"/>
+              </w:rPr>
+              <w:t xml:space="preserve">Calibration-limited regime (θ_QoE, Table IV): interface quality bounds decision quality</w:t>
+            </w:r>
+          </w:p>
+        </w:tc>
+        <w:tc>
+          <w:tcPr>
+            <w:tcW w:w="4100" w:type="dxa"/>
+            <w:vAlign w:val="center"/>
+          </w:tcPr>
+          <w:p>
+            <w:pPr>
+              <w:spacing w:after="30"/>
+            </w:pPr>
+            <w:r>
+              <w:rPr>
+                <w:sz w:val="15"/>
+                <w:szCs w:val="15"/>
+              </w:rPr>
+              <w:t xml:space="preserve">Physical-lab QoE on the twin leaves the efficient capability non-certifiable; measured distributions → re-calibration restores it (Fig. 3)</w:t>
+            </w:r>
+          </w:p>
+        </w:tc>
+        <w:tc>
+          <w:tcPr>
+            <w:tcW w:w="1850" w:type="dxa"/>
+            <w:vAlign w:val="center"/>
+          </w:tcPr>
+          <w:p>
+            <w:pPr>
+              <w:spacing w:after="30"/>
+            </w:pPr>
+            <w:r>
+              <w:rPr>
+                <w:sz w:val="15"/>
+                <w:szCs w:val="15"/>
+              </w:rPr>
+              <w:t xml:space="preserve">Confirmed (observed live)</w:t>
+            </w:r>
+          </w:p>
+        </w:tc>
+      </w:tr>
+      <w:tr>
+        <w:tc>
+          <w:tcPr>
+            <w:tcW w:w="3300" w:type="dxa"/>
+            <w:vAlign w:val="center"/>
+          </w:tcPr>
+          <w:p>
+            <w:pPr>
+              <w:spacing w:after="30"/>
+            </w:pPr>
+            <w:r>
+              <w:rPr>
+                <w:sz w:val="15"/>
+                <w:szCs w:val="15"/>
+              </w:rPr>
+              <w:t xml:space="preserve">Robustness certification ρ_DCA separates stable / boundary / non-certifiable regimes (Table V)</w:t>
+            </w:r>
+          </w:p>
+        </w:tc>
+        <w:tc>
+          <w:tcPr>
+            <w:tcW w:w="4100" w:type="dxa"/>
+            <w:vAlign w:val="center"/>
+          </w:tcPr>
+          <w:p>
+            <w:pPr>
+              <w:spacing w:after="30"/>
+            </w:pPr>
+            <w:r>
+              <w:rPr>
+                <w:sz w:val="15"/>
+                <w:szCs w:val="15"/>
+              </w:rPr>
+              <w:t xml:space="preserve">Runtime instantiation logged per decision: 1.50 clean vs 0.58 degraded (controlled); live traces certified in unambiguous zones, boundary under flickering readings (Fig. 6)</w:t>
+            </w:r>
+          </w:p>
+        </w:tc>
+        <w:tc>
+          <w:tcPr>
+            <w:tcW w:w="1850" w:type="dxa"/>
+            <w:vAlign w:val="center"/>
+          </w:tcPr>
+          <w:p>
+            <w:pPr>
+              <w:spacing w:after="30"/>
+            </w:pPr>
+            <w:r>
+              <w:rPr>
+                <w:sz w:val="15"/>
+                <w:szCs w:val="15"/>
+              </w:rPr>
+              <w:t xml:space="preserve">Confirmed ordinally; absolute scale pending B-calibration on physical traces</w:t>
+            </w:r>
+          </w:p>
+        </w:tc>
+      </w:tr>
+      <w:tr>
+        <w:tc>
+          <w:tcPr>
+            <w:tcW w:w="3300" w:type="dxa"/>
+            <w:vAlign w:val="center"/>
+          </w:tcPr>
+          <w:p>
+            <w:pPr>
+              <w:spacing w:after="30"/>
+            </w:pPr>
+            <w:r>
+              <w:rPr>
+                <w:sz w:val="15"/>
+                <w:szCs w:val="15"/>
+              </w:rPr>
+              <w:t xml:space="preserve">Hidden context is handled by compressing it into shared experience, interpreted per capability</w:t>
+            </w:r>
+          </w:p>
+        </w:tc>
+        <w:tc>
+          <w:tcPr>
+            <w:tcW w:w="4100" w:type="dxa"/>
+            <w:vAlign w:val="center"/>
+          </w:tcPr>
+          <w:p>
+            <w:pPr>
+              <w:spacing w:after="30"/>
+            </w:pPr>
+            <w:r>
+              <w:rPr>
+                <w:sz w:val="15"/>
+                <w:szCs w:val="15"/>
+              </w:rPr>
+              <w:t xml:space="preserve">Task-blind prior corrected within ≈4 s from per-tick shared-experience readings alone, before any failure materialises</w:t>
+            </w:r>
+          </w:p>
+        </w:tc>
+        <w:tc>
+          <w:tcPr>
+            <w:tcW w:w="1850" w:type="dxa"/>
+            <w:vAlign w:val="center"/>
+          </w:tcPr>
+          <w:p>
+            <w:pPr>
+              <w:spacing w:after="30"/>
+            </w:pPr>
+            <w:r>
+              <w:rPr>
+                <w:sz w:val="15"/>
+                <w:szCs w:val="15"/>
+              </w:rPr>
+              <w:t xml:space="preserve">Confirmed (measured)</w:t>
+            </w:r>
+          </w:p>
+        </w:tc>
+      </w:tr>
+    </w:tbl>
+    <w:p>
+      <w:pPr>
+        <w:spacing w:after="100" w:line="276" w:lineRule="auto"/>
+      </w:pPr>
+      <w:r>
+        <w:rPr>
+          <w:b/>
+          <w:color w:val="2E74B5"/>
+          <w:sz w:val="26"/>
+          <w:szCs w:val="26"/>
+        </w:rPr>
+        <w:t xml:space="preserve">6.2  Thesis (Chapter 5)</w:t>
+      </w:r>
+    </w:p>
+    <w:tbl>
+      <w:tblPr>
+        <w:tblW w:w="9250" w:type="dxa"/>
+        <w:tblBorders>
+          <w:top w:val="single" w:sz="4" w:color="8EAADB"/>
+          <w:left w:val="single" w:sz="4" w:color="8EAADB"/>
+          <w:bottom w:val="single" w:sz="4" w:color="8EAADB"/>
+          <w:right w:val="single" w:sz="4" w:color="8EAADB"/>
+          <w:insideH w:val="single" w:sz="4" w:color="8EAADB"/>
+          <w:insideV w:val="single" w:sz="4" w:color="8EAADB"/>
+        </w:tblBorders>
+      </w:tblPr>
+      <w:tblGrid>
+        <w:gridCol w:w="3300"/>
+        <w:gridCol w:w="4100"/>
+        <w:gridCol w:w="1850"/>
+      </w:tblGrid>
+      <w:tr>
+        <w:tc>
+          <w:tcPr>
+            <w:tcW w:w="3300" w:type="dxa"/>
+            <w:shd w:val="clear" w:color="auto" w:fill="1F3864"/>
+            <w:vAlign w:val="center"/>
+          </w:tcPr>
+          <w:p>
+            <w:pPr>
+              <w:spacing w:after="30"/>
+            </w:pPr>
+            <w:r>
+              <w:rPr>
+                <w:b/>
+                <w:color w:val="FFFFFF"/>
+                <w:sz w:val="15"/>
+                <w:szCs w:val="15"/>
+              </w:rPr>
+              <w:t xml:space="preserve">Claim</w:t>
+            </w:r>
+          </w:p>
+        </w:tc>
+        <w:tc>
+          <w:tcPr>
+            <w:tcW w:w="4100" w:type="dxa"/>
+            <w:shd w:val="clear" w:color="auto" w:fill="1F3864"/>
+            <w:vAlign w:val="center"/>
+          </w:tcPr>
+          <w:p>
+            <w:pPr>
+              <w:spacing w:after="30"/>
+            </w:pPr>
+            <w:r>
+              <w:rPr>
+                <w:b/>
+                <w:color w:val="FFFFFF"/>
+                <w:sz w:val="15"/>
+                <w:szCs w:val="15"/>
+              </w:rPr>
+              <w:t xml:space="preserve">Evidence</w:t>
+            </w:r>
+          </w:p>
+        </w:tc>
+        <w:tc>
+          <w:tcPr>
+            <w:tcW w:w="1850" w:type="dxa"/>
+            <w:shd w:val="clear" w:color="auto" w:fill="1F3864"/>
+            <w:vAlign w:val="center"/>
+          </w:tcPr>
+          <w:p>
+            <w:pPr>
+              <w:spacing w:after="30"/>
+            </w:pPr>
+            <w:r>
+              <w:rPr>
+                <w:b/>
+                <w:color w:val="FFFFFF"/>
+                <w:sz w:val="15"/>
+                <w:szCs w:val="15"/>
+              </w:rPr>
+              <w:t xml:space="preserve">Verdict</w:t>
+            </w:r>
+          </w:p>
+        </w:tc>
+      </w:tr>
+      <w:tr>
+        <w:tc>
+          <w:tcPr>
+            <w:tcW w:w="3300" w:type="dxa"/>
+            <w:vAlign w:val="center"/>
+          </w:tcPr>
+          <w:p>
+            <w:pPr>
+              <w:spacing w:after="30"/>
+            </w:pPr>
+            <w:r>
+              <w:rPr>
+                <w:sz w:val="15"/>
+                <w:szCs w:val="15"/>
+              </w:rPr>
+              <w:t xml:space="preserve">Safety ordering M0 &lt; M1 ≈ M2, with M2 adaptive rather than rigid (5.3.6.1, 5.3.6.3.1)</w:t>
+            </w:r>
+          </w:p>
+        </w:tc>
+        <w:tc>
+          <w:tcPr>
+            <w:tcW w:w="4100" w:type="dxa"/>
+            <w:vAlign w:val="center"/>
+          </w:tcPr>
+          <w:p>
+            <w:pPr>
+              <w:spacing w:after="30"/>
+            </w:pPr>
+            <w:r>
+              <w:rPr>
+                <w:sz w:val="15"/>
+                <w:szCs w:val="15"/>
+              </w:rPr>
+              <w:t xml:space="preserve">M0: 0.50 spills, 8.1% risk; M1 and M2: 0 spills. M2 alone re-certifies speed when conditions permit (L3 arm: 97.4 s vs M1 110.8 s at equal safety)</w:t>
+            </w:r>
+          </w:p>
+        </w:tc>
+        <w:tc>
+          <w:tcPr>
+            <w:tcW w:w="1850" w:type="dxa"/>
+            <w:vAlign w:val="center"/>
+          </w:tcPr>
+          <w:p>
+            <w:pPr>
+              <w:spacing w:after="30"/>
+            </w:pPr>
+            <w:r>
+              <w:rPr>
+                <w:sz w:val="15"/>
+                <w:szCs w:val="15"/>
+              </w:rPr>
+              <w:t xml:space="preserve">Confirmed</w:t>
+            </w:r>
+          </w:p>
+        </w:tc>
+      </w:tr>
+      <w:tr>
+        <w:tc>
+          <w:tcPr>
+            <w:tcW w:w="3300" w:type="dxa"/>
+            <w:vAlign w:val="center"/>
+          </w:tcPr>
+          <w:p>
+            <w:pPr>
+              <w:spacing w:after="30"/>
+            </w:pPr>
+            <w:r>
+              <w:rPr>
+                <w:sz w:val="15"/>
+                <w:szCs w:val="15"/>
+              </w:rPr>
+              <w:t xml:space="preserve">Zero-shot task-conditioned prior selection (5.3.6.4 lid flag → covered_delivery)</w:t>
+            </w:r>
+          </w:p>
+        </w:tc>
+        <w:tc>
+          <w:tcPr>
+            <w:tcW w:w="4100" w:type="dxa"/>
+            <w:vAlign w:val="center"/>
+          </w:tcPr>
+          <w:p>
+            <w:pPr>
+              <w:spacing w:after="30"/>
+            </w:pPr>
+            <w:r>
+              <w:rPr>
+                <w:sz w:val="15"/>
+                <w:szCs w:val="15"/>
+              </w:rPr>
+              <w:t xml:space="preserve">Sealed-lid governed arm on the calibrated twin: −9 s versus open-cup governance at equal safety; ungoverned baseline gains only passively (Fig. 4)</w:t>
+            </w:r>
+          </w:p>
+        </w:tc>
+        <w:tc>
+          <w:tcPr>
+            <w:tcW w:w="1850" w:type="dxa"/>
+            <w:vAlign w:val="center"/>
+          </w:tcPr>
+          <w:p>
+            <w:pPr>
+              <w:spacing w:after="30"/>
+            </w:pPr>
+            <w:r>
+              <w:rPr>
+                <w:sz w:val="15"/>
+                <w:szCs w:val="15"/>
+              </w:rPr>
+              <w:t xml:space="preserve">Confirmed</w:t>
+            </w:r>
+          </w:p>
+        </w:tc>
+      </w:tr>
+      <w:tr>
+        <w:tc>
+          <w:tcPr>
+            <w:tcW w:w="3300" w:type="dxa"/>
+            <w:vAlign w:val="center"/>
+          </w:tcPr>
+          <w:p>
+            <w:pPr>
+              <w:spacing w:after="30"/>
+            </w:pPr>
+            <w:r>
+              <w:rPr>
+                <w:sz w:val="15"/>
+                <w:szCs w:val="15"/>
+              </w:rPr>
+              <w:t xml:space="preserve">A wrong prior is recoverable through belief revision, never locked in (5.3.6.2-5.3.6.3)</w:t>
+            </w:r>
+          </w:p>
+        </w:tc>
+        <w:tc>
+          <w:tcPr>
+            <w:tcW w:w="4100" w:type="dxa"/>
+            <w:vAlign w:val="center"/>
+          </w:tcPr>
+          <w:p>
+            <w:pPr>
+              <w:spacing w:after="30"/>
+            </w:pPr>
+            <w:r>
+              <w:rPr>
+                <w:sz w:val="15"/>
+                <w:szCs w:val="15"/>
+              </w:rPr>
+              <w:t xml:space="preserve">Layer-2 Dempster fusion: Pl 1.00 → 0.75 → 0.53 → 0.36 under attributed spills; run 4 starts pre-corrected (Fig. 5). In the twin the failure signal is pre-empted by the faster layer; operational regime predicted to be the physical laboratory</w:t>
+            </w:r>
+          </w:p>
+        </w:tc>
+        <w:tc>
+          <w:tcPr>
+            <w:tcW w:w="1850" w:type="dxa"/>
+            <w:vAlign w:val="center"/>
+          </w:tcPr>
+          <w:p>
+            <w:pPr>
+              <w:spacing w:after="30"/>
+            </w:pPr>
+            <w:r>
+              <w:rPr>
+                <w:sz w:val="15"/>
+                <w:szCs w:val="15"/>
+              </w:rPr>
+              <w:t xml:space="preserve">Confirmed mechanistically; physical-robot exercise pending</w:t>
+            </w:r>
+          </w:p>
+        </w:tc>
+      </w:tr>
+      <w:tr>
+        <w:tc>
+          <w:tcPr>
+            <w:tcW w:w="3300" w:type="dxa"/>
+            <w:vAlign w:val="center"/>
+          </w:tcPr>
+          <w:p>
+            <w:pPr>
+              <w:spacing w:after="30"/>
+            </w:pPr>
+            <w:r>
+              <w:rPr>
+                <w:sz w:val="15"/>
+                <w:szCs w:val="15"/>
+              </w:rPr>
+              <w:t xml:space="preserve">Jerk — not speed alone — dominates spill risk (5.3.1.3)</w:t>
+            </w:r>
+          </w:p>
+        </w:tc>
+        <w:tc>
+          <w:tcPr>
+            <w:tcW w:w="4100" w:type="dxa"/>
+            <w:vAlign w:val="center"/>
+          </w:tcPr>
+          <w:p>
+            <w:pPr>
+              <w:spacing w:after="30"/>
+            </w:pPr>
+            <w:r>
+              <w:rPr>
+                <w:sz w:val="15"/>
+                <w:szCs w:val="15"/>
+              </w:rPr>
+              <w:t xml:space="preserve">Slosh model driven by acceleration (arm lever, gait ∝ v², impact impulses); commanded smooth stops do not spill, impacts and fast sustained gait do; calibrated ≈2 spills / 80 s at 0.30 m/s sustained</w:t>
+            </w:r>
+          </w:p>
+        </w:tc>
+        <w:tc>
+          <w:tcPr>
+            <w:tcW w:w="1850" w:type="dxa"/>
+            <w:vAlign w:val="center"/>
+          </w:tcPr>
+          <w:p>
+            <w:pPr>
+              <w:spacing w:after="30"/>
+            </w:pPr>
+            <w:r>
+              <w:rPr>
+                <w:sz w:val="15"/>
+                <w:szCs w:val="15"/>
+              </w:rPr>
+              <w:t xml:space="preserve">Confirmed by construction + calibration</w:t>
+            </w:r>
+          </w:p>
+        </w:tc>
+      </w:tr>
+      <w:tr>
+        <w:tc>
+          <w:tcPr>
+            <w:tcW w:w="3300" w:type="dxa"/>
+            <w:vAlign w:val="center"/>
+          </w:tcPr>
+          <w:p>
+            <w:pPr>
+              <w:spacing w:after="30"/>
+            </w:pPr>
+            <w:r>
+              <w:rPr>
+                <w:sz w:val="15"/>
+                <w:szCs w:val="15"/>
+              </w:rPr>
+              <w:t xml:space="preserve">Four belief layers at separated timescales, each catching a distinct failure mode (5.2.6.3)</w:t>
+            </w:r>
+          </w:p>
+        </w:tc>
+        <w:tc>
+          <w:tcPr>
+            <w:tcW w:w="4100" w:type="dxa"/>
+            <w:vAlign w:val="center"/>
+          </w:tcPr>
+          <w:p>
+            <w:pPr>
+              <w:spacing w:after="30"/>
+            </w:pPr>
+            <w:r>
+              <w:rPr>
+                <w:sz w:val="15"/>
+                <w:szCs w:val="15"/>
+              </w:rPr>
+              <w:t xml:space="preserve">All four realised (Table 2); L1/L2 exercised in campaign, L3/L4 validated in-loop (§5.1). The twin measures the L1-dominant regime — the timescale separation itself — with the L2-dominant regime correctly assigned to the physical lab</w:t>
+            </w:r>
+          </w:p>
+        </w:tc>
+        <w:tc>
+          <w:tcPr>
+            <w:tcW w:w="1850" w:type="dxa"/>
+            <w:vAlign w:val="center"/>
+          </w:tcPr>
+          <w:p>
+            <w:pPr>
+              <w:spacing w:after="30"/>
+            </w:pPr>
+            <w:r>
+              <w:rPr>
+                <w:sz w:val="15"/>
+                <w:szCs w:val="15"/>
+              </w:rPr>
+              <w:t xml:space="preserve">Confirmed; one regime per platform</w:t>
+            </w:r>
+          </w:p>
+        </w:tc>
+      </w:tr>
+      <w:tr>
+        <w:tc>
+          <w:tcPr>
+            <w:tcW w:w="3300" w:type="dxa"/>
+            <w:vAlign w:val="center"/>
+          </w:tcPr>
+          <w:p>
+            <w:pPr>
+              <w:spacing w:after="30"/>
+            </w:pPr>
+            <w:r>
+              <w:rPr>
+                <w:sz w:val="15"/>
+                <w:szCs w:val="15"/>
+              </w:rPr>
+              <w:t xml:space="preserve">Multi-environment generality (domestic/warehouse × clear/cluttered)</w:t>
+            </w:r>
+          </w:p>
+        </w:tc>
+        <w:tc>
+          <w:tcPr>
+            <w:tcW w:w="4100" w:type="dxa"/>
+            <w:vAlign w:val="center"/>
+          </w:tcPr>
+          <w:p>
+            <w:pPr>
+              <w:spacing w:after="30"/>
+            </w:pPr>
+            <w:r>
+              <w:rPr>
+                <w:sz w:val="15"/>
+                <w:szCs w:val="15"/>
+              </w:rPr>
+              <w:t xml:space="preserve">One environment (the laboratory twin) with open-versus-corridor contrast only</w:t>
+            </w:r>
+          </w:p>
+        </w:tc>
+        <w:tc>
+          <w:tcPr>
+            <w:tcW w:w="1850" w:type="dxa"/>
+            <w:vAlign w:val="center"/>
+          </w:tcPr>
+          <w:p>
+            <w:pPr>
+              <w:spacing w:after="30"/>
+            </w:pPr>
+            <w:r>
+              <w:rPr>
+                <w:sz w:val="15"/>
+                <w:szCs w:val="15"/>
+              </w:rPr>
+              <w:t xml:space="preserve">Not tested in the twin — covered by the 2-D study; physical campaign adds the real lab</w:t>
+            </w:r>
+          </w:p>
+        </w:tc>
+      </w:tr>
+    </w:tbl>
+    <w:p>
+      <w:pPr>
+        <w:spacing w:after="200" w:line="276" w:lineRule="auto"/>
+      </w:pPr>
+      <w:r>
+        <w:rPr>
+          <w:b/>
+        </w:rPr>
+        <w:t xml:space="preserve">Overall verdict.</w:t>
+      </w:r>
+      <w:r>
+        <w:t xml:space="preserve"> All instantiated claims are consistent with the observations; no result contradicts either the paper or the thesis. The two initially surprising observations — the flat Wrong-DST sequences and the inverted spatial profile of ρ̂ — both resolve into predictions of the theory once read at the correct level (timescale separation, and decision-robustness versus situational safety, respectively), and both readings are now stated explicitly in the manuscript support material.</w:t>
       </w:r>
     </w:p>
     <w:p>
@@ -3021,7 +3935,7 @@
           <w:sz w:val="20"/>
           <w:szCs w:val="20"/>
         </w:rPr>
-        <w:t xml:space="preserve">Datasets, configurations, the aggregation script and figure-generation code are versioned with the robot stack (commits up to the 2026-07-04 campaign; four-layer architecture and runtime certification ratio added in rev. 2).</w:t>
+        <w:t xml:space="preserve">Datasets, configurations, the aggregation script and figure-generation code are versioned with the robot stack (commits through the 2026-07-04 campaigns; rev. 3).</w:t>
       </w:r>
     </w:p>
     <w:sectPr>

</xml_diff>